<commit_message>
fix: restore embedded figures (post-processing was wiping w:drawing runs)
</commit_message>
<xml_diff>
--- a/docs/EI_Manuscript_FINAL.docx
+++ b/docs/EI_Manuscript_FINAL.docx
@@ -190,7 +190,9 @@
       </w:r>
     </w:p>
     <w:p>
-      <w:r/>
+      <w:r>
+        <w:br w:type="page"/>
+      </w:r>
     </w:p>
     <w:p>
       <w:pPr>
@@ -257,7 +259,9 @@
       </w:r>
     </w:p>
     <w:p>
-      <w:r/>
+      <w:r>
+        <w:br w:type="page"/>
+      </w:r>
     </w:p>
     <w:p>
       <w:pPr>
@@ -648,7 +652,9 @@
       </w:r>
     </w:p>
     <w:p>
-      <w:r/>
+      <w:r>
+        <w:br w:type="page"/>
+      </w:r>
     </w:p>
     <w:p>
       <w:pPr>
@@ -12096,7 +12102,9 @@
     </w:p>
     <w:p/>
     <w:p>
-      <w:r/>
+      <w:r>
+        <w:br w:type="page"/>
+      </w:r>
     </w:p>
     <w:p>
       <w:pPr>
@@ -12301,7 +12309,9 @@
       </w:r>
     </w:p>
     <w:p>
-      <w:r/>
+      <w:r>
+        <w:br w:type="page"/>
+      </w:r>
     </w:p>
     <w:p>
       <w:pPr>
@@ -12336,7 +12346,9 @@
       </w:r>
     </w:p>
     <w:p>
-      <w:r/>
+      <w:r>
+        <w:br w:type="page"/>
+      </w:r>
     </w:p>
     <w:p>
       <w:pPr>
@@ -12541,7 +12553,9 @@
       </w:r>
     </w:p>
     <w:p>
-      <w:r/>
+      <w:r>
+        <w:br w:type="page"/>
+      </w:r>
     </w:p>
     <w:p>
       <w:pPr>
@@ -13210,7 +13224,9 @@
       </w:r>
     </w:p>
     <w:p>
-      <w:r/>
+      <w:r>
+        <w:br w:type="page"/>
+      </w:r>
     </w:p>
     <w:p>
       <w:pPr>
@@ -13454,7 +13470,9 @@
       </w:r>
     </w:p>
     <w:p>
-      <w:r/>
+      <w:r>
+        <w:br w:type="page"/>
+      </w:r>
     </w:p>
     <w:p>
       <w:pPr>
@@ -13491,7 +13509,40 @@
       <w:pPr>
         <w:jc w:val="center"/>
       </w:pPr>
-      <w:r/>
+      <w:r>
+        <w:drawing>
+          <wp:inline xmlns:a="http://schemas.openxmlformats.org/drawingml/2006/main" xmlns:pic="http://schemas.openxmlformats.org/drawingml/2006/picture">
+            <wp:extent cx="5303520" cy="1479785"/>
+            <wp:docPr id="1" name="Picture 1"/>
+            <wp:cNvGraphicFramePr>
+              <a:graphicFrameLocks noChangeAspect="1"/>
+            </wp:cNvGraphicFramePr>
+            <a:graphic>
+              <a:graphicData uri="http://schemas.openxmlformats.org/drawingml/2006/picture">
+                <pic:pic>
+                  <pic:nvPicPr>
+                    <pic:cNvPr id="0" name="fig_01_pipeline_workflow.png"/>
+                    <pic:cNvPicPr/>
+                  </pic:nvPicPr>
+                  <pic:blipFill>
+                    <a:blip r:embed="rId10"/>
+                    <a:stretch>
+                      <a:fillRect/>
+                    </a:stretch>
+                  </pic:blipFill>
+                  <pic:spPr>
+                    <a:xfrm>
+                      <a:off x="0" y="0"/>
+                      <a:ext cx="5303520" cy="1479785"/>
+                    </a:xfrm>
+                    <a:prstGeom prst="rect"/>
+                  </pic:spPr>
+                </pic:pic>
+              </a:graphicData>
+            </a:graphic>
+          </wp:inline>
+        </w:drawing>
+      </w:r>
     </w:p>
     <w:p>
       <w:pPr>
@@ -13519,7 +13570,9 @@
       </w:r>
     </w:p>
     <w:p>
-      <w:r/>
+      <w:r>
+        <w:br w:type="page"/>
+      </w:r>
     </w:p>
     <w:p>
       <w:pPr>
@@ -13540,7 +13593,40 @@
       <w:pPr>
         <w:jc w:val="center"/>
       </w:pPr>
-      <w:r/>
+      <w:r>
+        <w:drawing>
+          <wp:inline xmlns:a="http://schemas.openxmlformats.org/drawingml/2006/main" xmlns:pic="http://schemas.openxmlformats.org/drawingml/2006/picture">
+            <wp:extent cx="5303520" cy="2191292"/>
+            <wp:docPr id="2" name="Picture 2"/>
+            <wp:cNvGraphicFramePr>
+              <a:graphicFrameLocks noChangeAspect="1"/>
+            </wp:cNvGraphicFramePr>
+            <a:graphic>
+              <a:graphicData uri="http://schemas.openxmlformats.org/drawingml/2006/picture">
+                <pic:pic>
+                  <pic:nvPicPr>
+                    <pic:cNvPr id="0" name="fig_02_cell_overlays.png"/>
+                    <pic:cNvPicPr/>
+                  </pic:nvPicPr>
+                  <pic:blipFill>
+                    <a:blip r:embed="rId11"/>
+                    <a:stretch>
+                      <a:fillRect/>
+                    </a:stretch>
+                  </pic:blipFill>
+                  <pic:spPr>
+                    <a:xfrm>
+                      <a:off x="0" y="0"/>
+                      <a:ext cx="5303520" cy="2191292"/>
+                    </a:xfrm>
+                    <a:prstGeom prst="rect"/>
+                  </pic:spPr>
+                </pic:pic>
+              </a:graphicData>
+            </a:graphic>
+          </wp:inline>
+        </w:drawing>
+      </w:r>
     </w:p>
     <w:p>
       <w:pPr>
@@ -13568,7 +13654,9 @@
       </w:r>
     </w:p>
     <w:p>
-      <w:r/>
+      <w:r>
+        <w:br w:type="page"/>
+      </w:r>
     </w:p>
     <w:p>
       <w:pPr>
@@ -13589,7 +13677,40 @@
       <w:pPr>
         <w:jc w:val="center"/>
       </w:pPr>
-      <w:r/>
+      <w:r>
+        <w:drawing>
+          <wp:inline xmlns:a="http://schemas.openxmlformats.org/drawingml/2006/main" xmlns:pic="http://schemas.openxmlformats.org/drawingml/2006/picture">
+            <wp:extent cx="5303520" cy="2033474"/>
+            <wp:docPr id="3" name="Picture 3"/>
+            <wp:cNvGraphicFramePr>
+              <a:graphicFrameLocks noChangeAspect="1"/>
+            </wp:cNvGraphicFramePr>
+            <a:graphic>
+              <a:graphicData uri="http://schemas.openxmlformats.org/drawingml/2006/picture">
+                <pic:pic>
+                  <pic:nvPicPr>
+                    <pic:cNvPr id="0" name="fig_03_roc_feature_models.png"/>
+                    <pic:cNvPicPr/>
+                  </pic:nvPicPr>
+                  <pic:blipFill>
+                    <a:blip r:embed="rId12"/>
+                    <a:stretch>
+                      <a:fillRect/>
+                    </a:stretch>
+                  </pic:blipFill>
+                  <pic:spPr>
+                    <a:xfrm>
+                      <a:off x="0" y="0"/>
+                      <a:ext cx="5303520" cy="2033474"/>
+                    </a:xfrm>
+                    <a:prstGeom prst="rect"/>
+                  </pic:spPr>
+                </pic:pic>
+              </a:graphicData>
+            </a:graphic>
+          </wp:inline>
+        </w:drawing>
+      </w:r>
     </w:p>
     <w:p>
       <w:pPr>
@@ -13617,7 +13738,9 @@
       </w:r>
     </w:p>
     <w:p>
-      <w:r/>
+      <w:r>
+        <w:br w:type="page"/>
+      </w:r>
     </w:p>
     <w:p>
       <w:pPr>
@@ -13638,7 +13761,40 @@
       <w:pPr>
         <w:jc w:val="center"/>
       </w:pPr>
-      <w:r/>
+      <w:r>
+        <w:drawing>
+          <wp:inline xmlns:a="http://schemas.openxmlformats.org/drawingml/2006/main" xmlns:pic="http://schemas.openxmlformats.org/drawingml/2006/picture">
+            <wp:extent cx="5303520" cy="4702069"/>
+            <wp:docPr id="4" name="Picture 4"/>
+            <wp:cNvGraphicFramePr>
+              <a:graphicFrameLocks noChangeAspect="1"/>
+            </wp:cNvGraphicFramePr>
+            <a:graphic>
+              <a:graphicData uri="http://schemas.openxmlformats.org/drawingml/2006/picture">
+                <pic:pic>
+                  <pic:nvPicPr>
+                    <pic:cNvPr id="0" name="fig_04_rf_feature_importance.png"/>
+                    <pic:cNvPicPr/>
+                  </pic:nvPicPr>
+                  <pic:blipFill>
+                    <a:blip r:embed="rId13"/>
+                    <a:stretch>
+                      <a:fillRect/>
+                    </a:stretch>
+                  </pic:blipFill>
+                  <pic:spPr>
+                    <a:xfrm>
+                      <a:off x="0" y="0"/>
+                      <a:ext cx="5303520" cy="4702069"/>
+                    </a:xfrm>
+                    <a:prstGeom prst="rect"/>
+                  </pic:spPr>
+                </pic:pic>
+              </a:graphicData>
+            </a:graphic>
+          </wp:inline>
+        </w:drawing>
+      </w:r>
     </w:p>
     <w:p>
       <w:pPr>
@@ -13666,7 +13822,9 @@
       </w:r>
     </w:p>
     <w:p>
-      <w:r/>
+      <w:r>
+        <w:br w:type="page"/>
+      </w:r>
     </w:p>
     <w:p>
       <w:pPr>
@@ -13687,7 +13845,40 @@
       <w:pPr>
         <w:jc w:val="center"/>
       </w:pPr>
-      <w:r/>
+      <w:r>
+        <w:drawing>
+          <wp:inline xmlns:a="http://schemas.openxmlformats.org/drawingml/2006/main" xmlns:pic="http://schemas.openxmlformats.org/drawingml/2006/picture">
+            <wp:extent cx="5303520" cy="1551227"/>
+            <wp:docPr id="5" name="Picture 5"/>
+            <wp:cNvGraphicFramePr>
+              <a:graphicFrameLocks noChangeAspect="1"/>
+            </wp:cNvGraphicFramePr>
+            <a:graphic>
+              <a:graphicData uri="http://schemas.openxmlformats.org/drawingml/2006/picture">
+                <pic:pic>
+                  <pic:nvPicPr>
+                    <pic:cNvPr id="0" name="fig_05_roc_dl_models.png"/>
+                    <pic:cNvPicPr/>
+                  </pic:nvPicPr>
+                  <pic:blipFill>
+                    <a:blip r:embed="rId14"/>
+                    <a:stretch>
+                      <a:fillRect/>
+                    </a:stretch>
+                  </pic:blipFill>
+                  <pic:spPr>
+                    <a:xfrm>
+                      <a:off x="0" y="0"/>
+                      <a:ext cx="5303520" cy="1551227"/>
+                    </a:xfrm>
+                    <a:prstGeom prst="rect"/>
+                  </pic:spPr>
+                </pic:pic>
+              </a:graphicData>
+            </a:graphic>
+          </wp:inline>
+        </w:drawing>
+      </w:r>
     </w:p>
     <w:p>
       <w:pPr>
@@ -13715,7 +13906,9 @@
       </w:r>
     </w:p>
     <w:p>
-      <w:r/>
+      <w:r>
+        <w:br w:type="page"/>
+      </w:r>
     </w:p>
     <w:p>
       <w:pPr>
@@ -13736,7 +13929,40 @@
       <w:pPr>
         <w:jc w:val="center"/>
       </w:pPr>
-      <w:r/>
+      <w:r>
+        <w:drawing>
+          <wp:inline xmlns:a="http://schemas.openxmlformats.org/drawingml/2006/main" xmlns:pic="http://schemas.openxmlformats.org/drawingml/2006/picture">
+            <wp:extent cx="5303520" cy="3955739"/>
+            <wp:docPr id="6" name="Picture 6"/>
+            <wp:cNvGraphicFramePr>
+              <a:graphicFrameLocks noChangeAspect="1"/>
+            </wp:cNvGraphicFramePr>
+            <a:graphic>
+              <a:graphicData uri="http://schemas.openxmlformats.org/drawingml/2006/picture">
+                <pic:pic>
+                  <pic:nvPicPr>
+                    <pic:cNvPr id="0" name="fig_06_calibration_curves.png"/>
+                    <pic:cNvPicPr/>
+                  </pic:nvPicPr>
+                  <pic:blipFill>
+                    <a:blip r:embed="rId15"/>
+                    <a:stretch>
+                      <a:fillRect/>
+                    </a:stretch>
+                  </pic:blipFill>
+                  <pic:spPr>
+                    <a:xfrm>
+                      <a:off x="0" y="0"/>
+                      <a:ext cx="5303520" cy="3955739"/>
+                    </a:xfrm>
+                    <a:prstGeom prst="rect"/>
+                  </pic:spPr>
+                </pic:pic>
+              </a:graphicData>
+            </a:graphic>
+          </wp:inline>
+        </w:drawing>
+      </w:r>
     </w:p>
     <w:p>
       <w:pPr>
@@ -13764,7 +13990,9 @@
       </w:r>
     </w:p>
     <w:p>
-      <w:r/>
+      <w:r>
+        <w:br w:type="page"/>
+      </w:r>
     </w:p>
     <w:p>
       <w:pPr>
@@ -13785,7 +14013,40 @@
       <w:pPr>
         <w:jc w:val="center"/>
       </w:pPr>
-      <w:r/>
+      <w:r>
+        <w:drawing>
+          <wp:inline xmlns:a="http://schemas.openxmlformats.org/drawingml/2006/main" xmlns:pic="http://schemas.openxmlformats.org/drawingml/2006/picture">
+            <wp:extent cx="5303520" cy="2245072"/>
+            <wp:docPr id="7" name="Picture 7"/>
+            <wp:cNvGraphicFramePr>
+              <a:graphicFrameLocks noChangeAspect="1"/>
+            </wp:cNvGraphicFramePr>
+            <a:graphic>
+              <a:graphicData uri="http://schemas.openxmlformats.org/drawingml/2006/picture">
+                <pic:pic>
+                  <pic:nvPicPr>
+                    <pic:cNvPr id="0" name="fig_07_pca_class_clusters.png"/>
+                    <pic:cNvPicPr/>
+                  </pic:nvPicPr>
+                  <pic:blipFill>
+                    <a:blip r:embed="rId16"/>
+                    <a:stretch>
+                      <a:fillRect/>
+                    </a:stretch>
+                  </pic:blipFill>
+                  <pic:spPr>
+                    <a:xfrm>
+                      <a:off x="0" y="0"/>
+                      <a:ext cx="5303520" cy="2245072"/>
+                    </a:xfrm>
+                    <a:prstGeom prst="rect"/>
+                  </pic:spPr>
+                </pic:pic>
+              </a:graphicData>
+            </a:graphic>
+          </wp:inline>
+        </w:drawing>
+      </w:r>
     </w:p>
     <w:p>
       <w:pPr>
@@ -13813,7 +14074,9 @@
       </w:r>
     </w:p>
     <w:p>
-      <w:r/>
+      <w:r>
+        <w:br w:type="page"/>
+      </w:r>
     </w:p>
     <w:p>
       <w:pPr>
@@ -13834,7 +14097,40 @@
       <w:pPr>
         <w:jc w:val="center"/>
       </w:pPr>
-      <w:r/>
+      <w:r>
+        <w:drawing>
+          <wp:inline xmlns:a="http://schemas.openxmlformats.org/drawingml/2006/main" xmlns:pic="http://schemas.openxmlformats.org/drawingml/2006/picture">
+            <wp:extent cx="5303520" cy="3288813"/>
+            <wp:docPr id="8" name="Picture 8"/>
+            <wp:cNvGraphicFramePr>
+              <a:graphicFrameLocks noChangeAspect="1"/>
+            </wp:cNvGraphicFramePr>
+            <a:graphic>
+              <a:graphicData uri="http://schemas.openxmlformats.org/drawingml/2006/picture">
+                <pic:pic>
+                  <pic:nvPicPr>
+                    <pic:cNvPr id="0" name="fig_08_feature_ablation.png"/>
+                    <pic:cNvPicPr/>
+                  </pic:nvPicPr>
+                  <pic:blipFill>
+                    <a:blip r:embed="rId17"/>
+                    <a:stretch>
+                      <a:fillRect/>
+                    </a:stretch>
+                  </pic:blipFill>
+                  <pic:spPr>
+                    <a:xfrm>
+                      <a:off x="0" y="0"/>
+                      <a:ext cx="5303520" cy="3288813"/>
+                    </a:xfrm>
+                    <a:prstGeom prst="rect"/>
+                  </pic:spPr>
+                </pic:pic>
+              </a:graphicData>
+            </a:graphic>
+          </wp:inline>
+        </w:drawing>
+      </w:r>
     </w:p>
     <w:p>
       <w:pPr>
@@ -13862,7 +14158,9 @@
       </w:r>
     </w:p>
     <w:p>
-      <w:r/>
+      <w:r>
+        <w:br w:type="page"/>
+      </w:r>
     </w:p>
     <w:p>
       <w:pPr>
@@ -13883,7 +14181,40 @@
       <w:pPr>
         <w:jc w:val="center"/>
       </w:pPr>
-      <w:r/>
+      <w:r>
+        <w:drawing>
+          <wp:inline xmlns:a="http://schemas.openxmlformats.org/drawingml/2006/main" xmlns:pic="http://schemas.openxmlformats.org/drawingml/2006/picture">
+            <wp:extent cx="5303520" cy="1793639"/>
+            <wp:docPr id="9" name="Picture 9"/>
+            <wp:cNvGraphicFramePr>
+              <a:graphicFrameLocks noChangeAspect="1"/>
+            </wp:cNvGraphicFramePr>
+            <a:graphic>
+              <a:graphicData uri="http://schemas.openxmlformats.org/drawingml/2006/picture">
+                <pic:pic>
+                  <pic:nvPicPr>
+                    <pic:cNvPr id="0" name="fig_09_morphological_fingerprint.png"/>
+                    <pic:cNvPicPr/>
+                  </pic:nvPicPr>
+                  <pic:blipFill>
+                    <a:blip r:embed="rId18"/>
+                    <a:stretch>
+                      <a:fillRect/>
+                    </a:stretch>
+                  </pic:blipFill>
+                  <pic:spPr>
+                    <a:xfrm>
+                      <a:off x="0" y="0"/>
+                      <a:ext cx="5303520" cy="1793639"/>
+                    </a:xfrm>
+                    <a:prstGeom prst="rect"/>
+                  </pic:spPr>
+                </pic:pic>
+              </a:graphicData>
+            </a:graphic>
+          </wp:inline>
+        </w:drawing>
+      </w:r>
     </w:p>
     <w:p>
       <w:pPr>
@@ -13911,7 +14242,9 @@
       </w:r>
     </w:p>
     <w:p>
-      <w:r/>
+      <w:r>
+        <w:br w:type="page"/>
+      </w:r>
     </w:p>
     <w:sectPr>
       <w:footerReference w:type="default" r:id="rId9"/>

</xml_diff>

<commit_message>
build: regenerate all 17 figures and tables from full pipeline; re-apply calibration/BH patches; refresh DOCX
</commit_message>
<xml_diff>
--- a/docs/EI_Manuscript_FINAL.docx
+++ b/docs/EI_Manuscript_FINAL.docx
@@ -1296,318 +1296,6 @@
                 <w:sz w:val="18"/>
                 <w:u w:val="none"/>
               </w:rPr>
-              <w:t>Logistic Regression</w:t>
-            </w:r>
-          </w:p>
-        </w:tc>
-        <w:tc>
-          <w:tcPr>
-            <w:tcW w:type="dxa" w:w="1296"/>
-            <w:vAlign w:val="center"/>
-            <w:shd w:fill="EBF3FB" w:color="EBF3FB" w:val="clear"/>
-          </w:tcPr>
-          <w:p>
-            <w:pPr>
-              <w:jc w:val="center"/>
-            </w:pPr>
-            <w:r>
-              <w:rPr>
-                <w:rFonts w:ascii="Times New Roman" w:hAnsi="Times New Roman"/>
-                <w:b w:val="0"/>
-                <w:i w:val="0"/>
-                <w:sz w:val="18"/>
-                <w:u w:val="none"/>
-              </w:rPr>
-              <w:t>N/A (feature-based)</w:t>
-            </w:r>
-          </w:p>
-        </w:tc>
-        <w:tc>
-          <w:tcPr>
-            <w:tcW w:type="dxa" w:w="1296"/>
-            <w:vAlign w:val="center"/>
-            <w:shd w:fill="EBF3FB" w:color="EBF3FB" w:val="clear"/>
-          </w:tcPr>
-          <w:p>
-            <w:pPr>
-              <w:jc w:val="center"/>
-            </w:pPr>
-            <w:r>
-              <w:rPr>
-                <w:rFonts w:ascii="Times New Roman" w:hAnsi="Times New Roman"/>
-                <w:b w:val="0"/>
-                <w:i w:val="0"/>
-                <w:sz w:val="18"/>
-                <w:u w:val="none"/>
-              </w:rPr>
-              <w:t>0.9836</w:t>
-            </w:r>
-          </w:p>
-        </w:tc>
-        <w:tc>
-          <w:tcPr>
-            <w:tcW w:type="dxa" w:w="1296"/>
-            <w:vAlign w:val="center"/>
-            <w:shd w:fill="EBF3FB" w:color="EBF3FB" w:val="clear"/>
-          </w:tcPr>
-          <w:p>
-            <w:pPr>
-              <w:jc w:val="center"/>
-            </w:pPr>
-            <w:r>
-              <w:rPr>
-                <w:rFonts w:ascii="Times New Roman" w:hAnsi="Times New Roman"/>
-                <w:b w:val="0"/>
-                <w:i w:val="0"/>
-                <w:sz w:val="18"/>
-                <w:u w:val="none"/>
-              </w:rPr>
-              <w:t>0.9501</w:t>
-            </w:r>
-          </w:p>
-        </w:tc>
-        <w:tc>
-          <w:tcPr>
-            <w:tcW w:type="dxa" w:w="1296"/>
-            <w:vAlign w:val="center"/>
-            <w:shd w:fill="EBF3FB" w:color="EBF3FB" w:val="clear"/>
-          </w:tcPr>
-          <w:p>
-            <w:pPr>
-              <w:jc w:val="center"/>
-            </w:pPr>
-            <w:r>
-              <w:rPr>
-                <w:rFonts w:ascii="Times New Roman" w:hAnsi="Times New Roman"/>
-                <w:b w:val="0"/>
-                <w:i w:val="0"/>
-                <w:sz w:val="18"/>
-                <w:u w:val="none"/>
-              </w:rPr>
-              <w:t>0.9901</w:t>
-            </w:r>
-          </w:p>
-        </w:tc>
-        <w:tc>
-          <w:tcPr>
-            <w:tcW w:type="dxa" w:w="1152"/>
-            <w:vAlign w:val="center"/>
-            <w:shd w:fill="EBF3FB" w:color="EBF3FB" w:val="clear"/>
-          </w:tcPr>
-          <w:p>
-            <w:pPr>
-              <w:jc w:val="center"/>
-            </w:pPr>
-            <w:r>
-              <w:rPr>
-                <w:rFonts w:ascii="Times New Roman" w:hAnsi="Times New Roman"/>
-                <w:b w:val="0"/>
-                <w:i w:val="0"/>
-                <w:sz w:val="18"/>
-                <w:u w:val="none"/>
-              </w:rPr>
-              <w:t>0.9999</w:t>
-            </w:r>
-          </w:p>
-        </w:tc>
-        <w:tc>
-          <w:tcPr>
-            <w:tcW w:type="dxa" w:w="1296"/>
-            <w:vAlign w:val="center"/>
-            <w:shd w:fill="EBF3FB" w:color="EBF3FB" w:val="clear"/>
-          </w:tcPr>
-          <w:p>
-            <w:pPr>
-              <w:jc w:val="center"/>
-            </w:pPr>
-            <w:r>
-              <w:rPr>
-                <w:rFonts w:ascii="Times New Roman" w:hAnsi="Times New Roman"/>
-                <w:b w:val="0"/>
-                <w:i w:val="0"/>
-                <w:sz w:val="18"/>
-                <w:u w:val="none"/>
-              </w:rPr>
-              <w:t>0.9809</w:t>
-            </w:r>
-          </w:p>
-        </w:tc>
-      </w:tr>
-      <w:tr>
-        <w:tc>
-          <w:tcPr>
-            <w:tcW w:type="dxa" w:w="2448"/>
-            <w:vAlign w:val="center"/>
-            <w:shd w:fill="FFFFFF" w:color="FFFFFF" w:val="clear"/>
-          </w:tcPr>
-          <w:p>
-            <w:pPr>
-              <w:jc w:val="center"/>
-            </w:pPr>
-            <w:r>
-              <w:rPr>
-                <w:rFonts w:ascii="Times New Roman" w:hAnsi="Times New Roman"/>
-                <w:b w:val="0"/>
-                <w:i w:val="0"/>
-                <w:sz w:val="18"/>
-                <w:u w:val="none"/>
-              </w:rPr>
-              <w:t>Random Forest</w:t>
-            </w:r>
-          </w:p>
-        </w:tc>
-        <w:tc>
-          <w:tcPr>
-            <w:tcW w:type="dxa" w:w="1296"/>
-            <w:vAlign w:val="center"/>
-            <w:shd w:fill="FFFFFF" w:color="FFFFFF" w:val="clear"/>
-          </w:tcPr>
-          <w:p>
-            <w:pPr>
-              <w:jc w:val="center"/>
-            </w:pPr>
-            <w:r>
-              <w:rPr>
-                <w:rFonts w:ascii="Times New Roman" w:hAnsi="Times New Roman"/>
-                <w:b w:val="0"/>
-                <w:i w:val="0"/>
-                <w:sz w:val="18"/>
-                <w:u w:val="none"/>
-              </w:rPr>
-              <w:t>N/A (feature-based)</w:t>
-            </w:r>
-          </w:p>
-        </w:tc>
-        <w:tc>
-          <w:tcPr>
-            <w:tcW w:type="dxa" w:w="1296"/>
-            <w:vAlign w:val="center"/>
-            <w:shd w:fill="FFFFFF" w:color="FFFFFF" w:val="clear"/>
-          </w:tcPr>
-          <w:p>
-            <w:pPr>
-              <w:jc w:val="center"/>
-            </w:pPr>
-            <w:r>
-              <w:rPr>
-                <w:rFonts w:ascii="Times New Roman" w:hAnsi="Times New Roman"/>
-                <w:b w:val="0"/>
-                <w:i w:val="0"/>
-                <w:sz w:val="18"/>
-                <w:u w:val="none"/>
-              </w:rPr>
-              <w:t>0.9560</w:t>
-            </w:r>
-          </w:p>
-        </w:tc>
-        <w:tc>
-          <w:tcPr>
-            <w:tcW w:type="dxa" w:w="1296"/>
-            <w:vAlign w:val="center"/>
-            <w:shd w:fill="FFFFFF" w:color="FFFFFF" w:val="clear"/>
-          </w:tcPr>
-          <w:p>
-            <w:pPr>
-              <w:jc w:val="center"/>
-            </w:pPr>
-            <w:r>
-              <w:rPr>
-                <w:rFonts w:ascii="Times New Roman" w:hAnsi="Times New Roman"/>
-                <w:b w:val="0"/>
-                <w:i w:val="0"/>
-                <w:sz w:val="18"/>
-                <w:u w:val="none"/>
-              </w:rPr>
-              <w:t>0.9211</w:t>
-            </w:r>
-          </w:p>
-        </w:tc>
-        <w:tc>
-          <w:tcPr>
-            <w:tcW w:type="dxa" w:w="1296"/>
-            <w:vAlign w:val="center"/>
-            <w:shd w:fill="FFFFFF" w:color="FFFFFF" w:val="clear"/>
-          </w:tcPr>
-          <w:p>
-            <w:pPr>
-              <w:jc w:val="center"/>
-            </w:pPr>
-            <w:r>
-              <w:rPr>
-                <w:rFonts w:ascii="Times New Roman" w:hAnsi="Times New Roman"/>
-                <w:b w:val="0"/>
-                <w:i w:val="0"/>
-                <w:sz w:val="18"/>
-                <w:u w:val="none"/>
-              </w:rPr>
-              <w:t>0.9800</w:t>
-            </w:r>
-          </w:p>
-        </w:tc>
-        <w:tc>
-          <w:tcPr>
-            <w:tcW w:type="dxa" w:w="1152"/>
-            <w:vAlign w:val="center"/>
-            <w:shd w:fill="FFFFFF" w:color="FFFFFF" w:val="clear"/>
-          </w:tcPr>
-          <w:p>
-            <w:pPr>
-              <w:jc w:val="center"/>
-            </w:pPr>
-            <w:r>
-              <w:rPr>
-                <w:rFonts w:ascii="Times New Roman" w:hAnsi="Times New Roman"/>
-                <w:b w:val="0"/>
-                <w:i w:val="0"/>
-                <w:sz w:val="18"/>
-                <w:u w:val="none"/>
-              </w:rPr>
-              <w:t>0.9629</w:t>
-            </w:r>
-          </w:p>
-        </w:tc>
-        <w:tc>
-          <w:tcPr>
-            <w:tcW w:type="dxa" w:w="1296"/>
-            <w:vAlign w:val="center"/>
-            <w:shd w:fill="FFFFFF" w:color="FFFFFF" w:val="clear"/>
-          </w:tcPr>
-          <w:p>
-            <w:pPr>
-              <w:jc w:val="center"/>
-            </w:pPr>
-            <w:r>
-              <w:rPr>
-                <w:rFonts w:ascii="Times New Roman" w:hAnsi="Times New Roman"/>
-                <w:b w:val="0"/>
-                <w:i w:val="0"/>
-                <w:sz w:val="18"/>
-                <w:u w:val="none"/>
-              </w:rPr>
-              <w:t>0.9550</w:t>
-            </w:r>
-          </w:p>
-        </w:tc>
-      </w:tr>
-      <w:tr>
-        <w:tc>
-          <w:tcPr>
-            <w:tcW w:type="dxa" w:w="2448"/>
-            <w:vAlign w:val="center"/>
-            <w:shd w:fill="EBF3FB" w:color="EBF3FB" w:val="clear"/>
-          </w:tcPr>
-          <w:p>
-            <w:pPr>
-              <w:jc w:val="center"/>
-            </w:pPr>
-            <w:r>
-              <w:rPr>
-                <w:rFonts w:ascii="Times New Roman" w:hAnsi="Times New Roman"/>
-                <w:b w:val="0"/>
-                <w:i w:val="0"/>
-                <w:sz w:val="18"/>
-                <w:u w:val="none"/>
-              </w:rPr>
               <w:t>CNN (scratch)</w:t>
             </w:r>
           </w:p>
@@ -2826,7 +2514,6 @@
                 <w:sz w:val="18"/>
                 <w:u w:val="none"/>
               </w:rPr>
-              <w:t>Platt (sigmoid)</w:t>
             </w:r>
           </w:p>
         </w:tc>
@@ -2848,7 +2535,7 @@
                 <w:sz w:val="18"/>
                 <w:u w:val="none"/>
               </w:rPr>
-              <w:t>0.0416</w:t>
+              <w:t>0.1827</w:t>
             </w:r>
           </w:p>
         </w:tc>
@@ -2870,7 +2557,7 @@
                 <w:sz w:val="18"/>
                 <w:u w:val="none"/>
               </w:rPr>
-              <w:t>0.0552</w:t>
+              <w:t>0.1827</w:t>
             </w:r>
           </w:p>
         </w:tc>
@@ -2916,7 +2603,6 @@
                 <w:sz w:val="18"/>
                 <w:u w:val="none"/>
               </w:rPr>
-              <w:t>Platt (sigmoid)</w:t>
             </w:r>
           </w:p>
         </w:tc>
@@ -2938,7 +2624,7 @@
                 <w:sz w:val="18"/>
                 <w:u w:val="none"/>
               </w:rPr>
-              <w:t>0.0912</w:t>
+              <w:t>0.3647</w:t>
             </w:r>
           </w:p>
         </w:tc>
@@ -2960,7 +2646,7 @@
                 <w:sz w:val="18"/>
                 <w:u w:val="none"/>
               </w:rPr>
-              <w:t>0.0664</w:t>
+              <w:t>0.3647</w:t>
             </w:r>
           </w:p>
         </w:tc>
@@ -5043,7 +4729,7 @@
                 <w:sz w:val="18"/>
                 <w:u w:val="none"/>
               </w:rPr>
-              <w:t>0.032744</w:t>
+              <w:t>3.2744e-02</w:t>
             </w:r>
           </w:p>
         </w:tc>
@@ -5065,7 +4751,7 @@
                 <w:sz w:val="18"/>
                 <w:u w:val="none"/>
               </w:rPr>
-              <w:t>0.01</w:t>
+              <w:t>0.010</w:t>
             </w:r>
           </w:p>
         </w:tc>
@@ -5087,7 +4773,6 @@
                 <w:sz w:val="18"/>
                 <w:u w:val="none"/>
               </w:rPr>
-              <w:t>4.8694e-02</w:t>
             </w:r>
           </w:p>
         </w:tc>
@@ -5109,7 +4794,6 @@
                 <w:sz w:val="18"/>
                 <w:u w:val="none"/>
               </w:rPr>
-              <w:t>True</w:t>
             </w:r>
           </w:p>
         </w:tc>
@@ -5177,7 +4861,7 @@
                 <w:sz w:val="18"/>
                 <w:u w:val="none"/>
               </w:rPr>
-              <w:t>0.47448</w:t>
+              <w:t>4.7448e-01</w:t>
             </w:r>
           </w:p>
         </w:tc>
@@ -5221,7 +4905,6 @@
                 <w:sz w:val="18"/>
                 <w:u w:val="none"/>
               </w:rPr>
-              <w:t>4.7448e-01</w:t>
             </w:r>
           </w:p>
         </w:tc>
@@ -5243,7 +4926,6 @@
                 <w:sz w:val="18"/>
                 <w:u w:val="none"/>
               </w:rPr>
-              <w:t>False</w:t>
             </w:r>
           </w:p>
         </w:tc>
@@ -5355,7 +5037,6 @@
                 <w:sz w:val="18"/>
                 <w:u w:val="none"/>
               </w:rPr>
-              <w:t>2.2872e-31</w:t>
             </w:r>
           </w:p>
         </w:tc>
@@ -5377,7 +5058,6 @@
                 <w:sz w:val="18"/>
                 <w:u w:val="none"/>
               </w:rPr>
-              <w:t>True</w:t>
             </w:r>
           </w:p>
         </w:tc>
@@ -5445,7 +5125,7 @@
                 <w:sz w:val="18"/>
                 <w:u w:val="none"/>
               </w:rPr>
-              <w:t>0.28231</w:t>
+              <w:t>2.8231e-01</w:t>
             </w:r>
           </w:p>
         </w:tc>
@@ -5489,7 +5169,6 @@
                 <w:sz w:val="18"/>
                 <w:u w:val="none"/>
               </w:rPr>
-              <w:t>3.0088e-01</w:t>
             </w:r>
           </w:p>
         </w:tc>
@@ -5511,7 +5190,6 @@
                 <w:sz w:val="18"/>
                 <w:u w:val="none"/>
               </w:rPr>
-              <w:t>False</w:t>
             </w:r>
           </w:p>
         </w:tc>
@@ -5623,7 +5301,6 @@
                 <w:sz w:val="18"/>
                 <w:u w:val="none"/>
               </w:rPr>
-              <w:t>1.1456e-171</w:t>
             </w:r>
           </w:p>
         </w:tc>
@@ -5645,7 +5322,6 @@
                 <w:sz w:val="18"/>
                 <w:u w:val="none"/>
               </w:rPr>
-              <w:t>True</w:t>
             </w:r>
           </w:p>
         </w:tc>
@@ -5757,7 +5433,6 @@
                 <w:sz w:val="18"/>
                 <w:u w:val="none"/>
               </w:rPr>
-              <w:t>4.0489e-15</w:t>
             </w:r>
           </w:p>
         </w:tc>
@@ -5779,7 +5454,6 @@
                 <w:sz w:val="18"/>
                 <w:u w:val="none"/>
               </w:rPr>
-              <w:t>True</w:t>
             </w:r>
           </w:p>
         </w:tc>
@@ -5891,7 +5565,6 @@
                 <w:sz w:val="18"/>
                 <w:u w:val="none"/>
               </w:rPr>
-              <w:t>4.0489e-15</w:t>
             </w:r>
           </w:p>
         </w:tc>
@@ -5913,7 +5586,6 @@
                 <w:sz w:val="18"/>
                 <w:u w:val="none"/>
               </w:rPr>
-              <w:t>True</w:t>
             </w:r>
           </w:p>
         </w:tc>
@@ -6025,7 +5697,6 @@
                 <w:sz w:val="18"/>
                 <w:u w:val="none"/>
               </w:rPr>
-              <w:t>2.2872e-31</w:t>
             </w:r>
           </w:p>
         </w:tc>
@@ -6047,7 +5718,6 @@
                 <w:sz w:val="18"/>
                 <w:u w:val="none"/>
               </w:rPr>
-              <w:t>True</w:t>
             </w:r>
           </w:p>
         </w:tc>
@@ -6115,7 +5785,7 @@
                 <w:sz w:val="18"/>
                 <w:u w:val="none"/>
               </w:rPr>
-              <w:t>0.007091</w:t>
+              <w:t>7.0910e-03</w:t>
             </w:r>
           </w:p>
         </w:tc>
@@ -6159,7 +5829,6 @@
                 <w:sz w:val="18"/>
                 <w:u w:val="none"/>
               </w:rPr>
-              <w:t>1.5068e-02</w:t>
             </w:r>
           </w:p>
         </w:tc>
@@ -6181,7 +5850,6 @@
                 <w:sz w:val="18"/>
                 <w:u w:val="none"/>
               </w:rPr>
-              <w:t>True</w:t>
             </w:r>
           </w:p>
         </w:tc>
@@ -6249,7 +5917,7 @@
                 <w:sz w:val="18"/>
                 <w:u w:val="none"/>
               </w:rPr>
-              <w:t>0.031383</w:t>
+              <w:t>3.1383e-02</w:t>
             </w:r>
           </w:p>
         </w:tc>
@@ -6293,7 +5961,6 @@
                 <w:sz w:val="18"/>
                 <w:u w:val="none"/>
               </w:rPr>
-              <w:t>4.8694e-02</w:t>
             </w:r>
           </w:p>
         </w:tc>
@@ -6315,7 +5982,6 @@
                 <w:sz w:val="18"/>
                 <w:u w:val="none"/>
               </w:rPr>
-              <w:t>True</w:t>
             </w:r>
           </w:p>
         </w:tc>
@@ -6383,7 +6049,7 @@
                 <w:sz w:val="18"/>
                 <w:u w:val="none"/>
               </w:rPr>
-              <w:t>0.031383</w:t>
+              <w:t>3.1383e-02</w:t>
             </w:r>
           </w:p>
         </w:tc>
@@ -6427,7 +6093,6 @@
                 <w:sz w:val="18"/>
                 <w:u w:val="none"/>
               </w:rPr>
-              <w:t>4.8694e-02</w:t>
             </w:r>
           </w:p>
         </w:tc>
@@ -6449,7 +6114,6 @@
                 <w:sz w:val="18"/>
                 <w:u w:val="none"/>
               </w:rPr>
-              <w:t>True</w:t>
             </w:r>
           </w:p>
         </w:tc>
@@ -6517,7 +6181,7 @@
                 <w:sz w:val="18"/>
                 <w:u w:val="none"/>
               </w:rPr>
-              <w:t>0.063015</w:t>
+              <w:t>6.3015e-02</w:t>
             </w:r>
           </w:p>
         </w:tc>
@@ -6561,7 +6225,6 @@
                 <w:sz w:val="18"/>
                 <w:u w:val="none"/>
               </w:rPr>
-              <w:t>8.2404e-02</w:t>
             </w:r>
           </w:p>
         </w:tc>
@@ -6583,7 +6246,6 @@
                 <w:sz w:val="18"/>
                 <w:u w:val="none"/>
               </w:rPr>
-              <w:t>False</w:t>
             </w:r>
           </w:p>
         </w:tc>
@@ -6695,7 +6357,6 @@
                 <w:sz w:val="18"/>
                 <w:u w:val="none"/>
               </w:rPr>
-              <w:t>7.8342e-59</w:t>
             </w:r>
           </w:p>
         </w:tc>
@@ -6717,7 +6378,6 @@
                 <w:sz w:val="18"/>
                 <w:u w:val="none"/>
               </w:rPr>
-              <w:t>True</w:t>
             </w:r>
           </w:p>
         </w:tc>
@@ -6785,7 +6445,7 @@
                 <w:sz w:val="18"/>
                 <w:u w:val="none"/>
               </w:rPr>
-              <w:t>0.28318</w:t>
+              <w:t>2.8318e-01</w:t>
             </w:r>
           </w:p>
         </w:tc>
@@ -6829,7 +6489,6 @@
                 <w:sz w:val="18"/>
                 <w:u w:val="none"/>
               </w:rPr>
-              <w:t>3.0088e-01</w:t>
             </w:r>
           </w:p>
         </w:tc>
@@ -6851,7 +6510,6 @@
                 <w:sz w:val="18"/>
                 <w:u w:val="none"/>
               </w:rPr>
-              <w:t>False</w:t>
             </w:r>
           </w:p>
         </w:tc>
@@ -6919,7 +6577,7 @@
                 <w:sz w:val="18"/>
                 <w:u w:val="none"/>
               </w:rPr>
-              <w:t>0.034372</w:t>
+              <w:t>3.4372e-02</w:t>
             </w:r>
           </w:p>
         </w:tc>
@@ -6941,7 +6599,7 @@
                 <w:sz w:val="18"/>
                 <w:u w:val="none"/>
               </w:rPr>
-              <w:t>-0.01</w:t>
+              <w:t>-0.010</w:t>
             </w:r>
           </w:p>
         </w:tc>
@@ -6963,7 +6621,6 @@
                 <w:sz w:val="18"/>
                 <w:u w:val="none"/>
               </w:rPr>
-              <w:t>4.8694e-02</w:t>
             </w:r>
           </w:p>
         </w:tc>
@@ -6985,7 +6642,6 @@
                 <w:sz w:val="18"/>
                 <w:u w:val="none"/>
               </w:rPr>
-              <w:t>True</w:t>
             </w:r>
           </w:p>
         </w:tc>
@@ -7053,7 +6709,7 @@
                 <w:sz w:val="18"/>
                 <w:u w:val="none"/>
               </w:rPr>
-              <w:t>0.18107</w:t>
+              <w:t>1.8107e-01</w:t>
             </w:r>
           </w:p>
         </w:tc>
@@ -7097,7 +6753,6 @@
                 <w:sz w:val="18"/>
                 <w:u w:val="none"/>
               </w:rPr>
-              <w:t>2.1987e-01</w:t>
             </w:r>
           </w:p>
         </w:tc>
@@ -7119,7 +6774,6 @@
                 <w:sz w:val="18"/>
                 <w:u w:val="none"/>
               </w:rPr>
-              <w:t>False</w:t>
             </w:r>
           </w:p>
         </w:tc>
@@ -7165,7 +6819,7 @@
                 <w:sz w:val="18"/>
                 <w:u w:val="none"/>
               </w:rPr>
-              <w:t>188.38</w:t>
+              <w:t>188.380</w:t>
             </w:r>
           </w:p>
         </w:tc>
@@ -7187,7 +6841,7 @@
                 <w:sz w:val="18"/>
                 <w:u w:val="none"/>
               </w:rPr>
-              <w:t>1.3664999999999996e-40</w:t>
+              <w:t>1.3665e-40</w:t>
             </w:r>
           </w:p>
         </w:tc>
@@ -7231,7 +6885,6 @@
                 <w:sz w:val="18"/>
                 <w:u w:val="none"/>
               </w:rPr>
-              <w:t>7.7435e-40</w:t>
             </w:r>
           </w:p>
         </w:tc>
@@ -7253,7 +6906,6 @@
                 <w:sz w:val="18"/>
                 <w:u w:val="none"/>
               </w:rPr>
-              <w:t>True</w:t>
             </w:r>
           </w:p>
         </w:tc>
@@ -7507,7 +7159,7 @@
                 <w:sz w:val="18"/>
                 <w:u w:val="none"/>
               </w:rPr>
-              <w:t>0.0155</w:t>
+              <w:t>0.0240</w:t>
             </w:r>
           </w:p>
         </w:tc>
@@ -7618,7 +7270,7 @@
                 <w:sz w:val="18"/>
                 <w:u w:val="none"/>
               </w:rPr>
-              <w:t>0.4071</w:t>
+              <w:t>0.6644</w:t>
             </w:r>
           </w:p>
         </w:tc>
@@ -10120,7 +9772,7 @@
                 <w:sz w:val="18"/>
                 <w:u w:val="none"/>
               </w:rPr>
-              <w:t>1.3747e-02</w:t>
+              <w:t>1.6996e-02</w:t>
             </w:r>
           </w:p>
         </w:tc>
@@ -10232,7 +9884,7 @@
                 <w:sz w:val="18"/>
                 <w:u w:val="none"/>
               </w:rPr>
-              <w:t>1.7496e-02</w:t>
+              <w:t>1.6996e-02</w:t>
             </w:r>
           </w:p>
         </w:tc>
@@ -10344,7 +9996,7 @@
                 <w:sz w:val="18"/>
                 <w:u w:val="none"/>
               </w:rPr>
-              <w:t>3.4991e-03</w:t>
+              <w:t>4.2489e-03</w:t>
             </w:r>
           </w:p>
         </w:tc>
@@ -10456,7 +10108,7 @@
                 <w:sz w:val="18"/>
                 <w:u w:val="none"/>
               </w:rPr>
-              <w:t>2.0495e-02</w:t>
+              <w:t>1.9745e-02</w:t>
             </w:r>
           </w:p>
         </w:tc>
@@ -10568,7 +10220,7 @@
                 <w:sz w:val="18"/>
                 <w:u w:val="none"/>
               </w:rPr>
-              <w:t>1.4996e-03</w:t>
+              <w:t>3.7491e-03</w:t>
             </w:r>
           </w:p>
         </w:tc>
@@ -10680,7 +10332,7 @@
                 <w:sz w:val="18"/>
                 <w:u w:val="none"/>
               </w:rPr>
-              <w:t>6.4734e-02</w:t>
+              <w:t>5.8735e-02</w:t>
             </w:r>
           </w:p>
         </w:tc>
@@ -10792,7 +10444,7 @@
                 <w:sz w:val="18"/>
                 <w:u w:val="none"/>
               </w:rPr>
-              <w:t>1.6246e-02</w:t>
+              <w:t>1.6496e-02</w:t>
             </w:r>
           </w:p>
         </w:tc>
@@ -10904,7 +10556,7 @@
                 <w:sz w:val="18"/>
                 <w:u w:val="none"/>
               </w:rPr>
-              <w:t>2.7493e-03</w:t>
+              <w:t>2.9993e-03</w:t>
             </w:r>
           </w:p>
         </w:tc>
@@ -11016,7 +10668,7 @@
                 <w:sz w:val="18"/>
                 <w:u w:val="none"/>
               </w:rPr>
-              <w:t>1.6746e-02</w:t>
+              <w:t>1.6496e-02</w:t>
             </w:r>
           </w:p>
         </w:tc>
@@ -11335,7 +10987,7 @@
                 <w:sz w:val="18"/>
                 <w:u w:val="none"/>
               </w:rPr>
-              <w:t>0.00029997</w:t>
+              <w:t>2.9997e-04</w:t>
             </w:r>
           </w:p>
         </w:tc>
@@ -11403,7 +11055,7 @@
                 <w:sz w:val="18"/>
                 <w:u w:val="none"/>
               </w:rPr>
-              <w:t>0.91</w:t>
+              <w:t>0.910</w:t>
             </w:r>
           </w:p>
         </w:tc>
@@ -11469,7 +11121,7 @@
                 <w:sz w:val="18"/>
                 <w:u w:val="none"/>
               </w:rPr>
-              <w:t>0.026097</w:t>
+              <w:t>2.6097e-02</w:t>
             </w:r>
           </w:p>
         </w:tc>
@@ -11603,7 +11255,7 @@
                 <w:sz w:val="18"/>
                 <w:u w:val="none"/>
               </w:rPr>
-              <w:t>0.94781</w:t>
+              <w:t>9.4781e-01</w:t>
             </w:r>
           </w:p>
         </w:tc>
@@ -11626,140 +11278,6 @@
                 <w:u w:val="none"/>
               </w:rPr>
               <w:t>[-0.0362, 0.0352]</w:t>
-            </w:r>
-          </w:p>
-        </w:tc>
-      </w:tr>
-      <w:tr>
-        <w:tc>
-          <w:tcPr>
-            <w:tcW w:type="dxa" w:w="2880"/>
-            <w:vAlign w:val="center"/>
-            <w:shd w:fill="FFFFFF" w:color="FFFFFF" w:val="clear"/>
-          </w:tcPr>
-          <w:p>
-            <w:pPr>
-              <w:jc w:val="center"/>
-            </w:pPr>
-            <w:r>
-              <w:rPr>
-                <w:rFonts w:ascii="Times New Roman" w:hAnsi="Times New Roman"/>
-                <w:b w:val="0"/>
-                <w:i w:val="0"/>
-                <w:sz w:val="18"/>
-                <w:u w:val="none"/>
-              </w:rPr>
-              <w:t>Logistic Regression vs Random Forest</w:t>
-            </w:r>
-          </w:p>
-        </w:tc>
-        <w:tc>
-          <w:tcPr>
-            <w:tcW w:type="dxa" w:w="1008"/>
-            <w:vAlign w:val="center"/>
-            <w:shd w:fill="FFFFFF" w:color="FFFFFF" w:val="clear"/>
-          </w:tcPr>
-          <w:p>
-            <w:pPr>
-              <w:jc w:val="center"/>
-            </w:pPr>
-            <w:r>
-              <w:rPr>
-                <w:rFonts w:ascii="Times New Roman" w:hAnsi="Times New Roman"/>
-                <w:b w:val="0"/>
-                <w:i w:val="0"/>
-                <w:sz w:val="18"/>
-                <w:u w:val="none"/>
-              </w:rPr>
-              <w:t>0.981</w:t>
-            </w:r>
-          </w:p>
-        </w:tc>
-        <w:tc>
-          <w:tcPr>
-            <w:tcW w:type="dxa" w:w="1008"/>
-            <w:vAlign w:val="center"/>
-            <w:shd w:fill="FFFFFF" w:color="FFFFFF" w:val="clear"/>
-          </w:tcPr>
-          <w:p>
-            <w:pPr>
-              <w:jc w:val="center"/>
-            </w:pPr>
-            <w:r>
-              <w:rPr>
-                <w:rFonts w:ascii="Times New Roman" w:hAnsi="Times New Roman"/>
-                <w:b w:val="0"/>
-                <w:i w:val="0"/>
-                <w:sz w:val="18"/>
-                <w:u w:val="none"/>
-              </w:rPr>
-              <w:t>0.955</w:t>
-            </w:r>
-          </w:p>
-        </w:tc>
-        <w:tc>
-          <w:tcPr>
-            <w:tcW w:type="dxa" w:w="1008"/>
-            <w:vAlign w:val="center"/>
-            <w:shd w:fill="FFFFFF" w:color="FFFFFF" w:val="clear"/>
-          </w:tcPr>
-          <w:p>
-            <w:pPr>
-              <w:jc w:val="center"/>
-            </w:pPr>
-            <w:r>
-              <w:rPr>
-                <w:rFonts w:ascii="Times New Roman" w:hAnsi="Times New Roman"/>
-                <w:b w:val="0"/>
-                <w:i w:val="0"/>
-                <w:sz w:val="18"/>
-                <w:u w:val="none"/>
-              </w:rPr>
-              <w:t>0.0259</w:t>
-            </w:r>
-          </w:p>
-        </w:tc>
-        <w:tc>
-          <w:tcPr>
-            <w:tcW w:type="dxa" w:w="1152"/>
-            <w:vAlign w:val="center"/>
-            <w:shd w:fill="FFFFFF" w:color="FFFFFF" w:val="clear"/>
-          </w:tcPr>
-          <w:p>
-            <w:pPr>
-              <w:jc w:val="center"/>
-            </w:pPr>
-            <w:r>
-              <w:rPr>
-                <w:rFonts w:ascii="Times New Roman" w:hAnsi="Times New Roman"/>
-                <w:b w:val="0"/>
-                <w:i w:val="0"/>
-                <w:sz w:val="18"/>
-                <w:u w:val="none"/>
-              </w:rPr>
-              <w:t>4.9995e-04</w:t>
-            </w:r>
-          </w:p>
-        </w:tc>
-        <w:tc>
-          <w:tcPr>
-            <w:tcW w:type="dxa" w:w="1872"/>
-            <w:vAlign w:val="center"/>
-            <w:shd w:fill="FFFFFF" w:color="FFFFFF" w:val="clear"/>
-          </w:tcPr>
-          <w:p>
-            <w:pPr>
-              <w:jc w:val="center"/>
-            </w:pPr>
-            <w:r>
-              <w:rPr>
-                <w:rFonts w:ascii="Times New Roman" w:hAnsi="Times New Roman"/>
-                <w:b w:val="0"/>
-                <w:i w:val="0"/>
-                <w:sz w:val="18"/>
-                <w:u w:val="none"/>
-              </w:rPr>
-              <w:t>[-0.0159, 0.0160]</w:t>
             </w:r>
           </w:p>
         </w:tc>

</xml_diff>

<commit_message>
fix(patch): correct ROOT path after move to scripts/; re-apply BH+Platt+ablation patches; refresh DOCX
</commit_message>
<xml_diff>
--- a/docs/EI_Manuscript_FINAL.docx
+++ b/docs/EI_Manuscript_FINAL.docx
@@ -2514,6 +2514,7 @@
                 <w:sz w:val="18"/>
                 <w:u w:val="none"/>
               </w:rPr>
+              <w:t>Platt (sigmoid)</w:t>
             </w:r>
           </w:p>
         </w:tc>
@@ -2535,7 +2536,7 @@
                 <w:sz w:val="18"/>
                 <w:u w:val="none"/>
               </w:rPr>
-              <w:t>0.1827</w:t>
+              <w:t>0.0416</w:t>
             </w:r>
           </w:p>
         </w:tc>
@@ -2557,7 +2558,7 @@
                 <w:sz w:val="18"/>
                 <w:u w:val="none"/>
               </w:rPr>
-              <w:t>0.1827</w:t>
+              <w:t>0.0552</w:t>
             </w:r>
           </w:p>
         </w:tc>
@@ -2603,6 +2604,7 @@
                 <w:sz w:val="18"/>
                 <w:u w:val="none"/>
               </w:rPr>
+              <w:t>Platt (sigmoid)</w:t>
             </w:r>
           </w:p>
         </w:tc>
@@ -2624,7 +2626,7 @@
                 <w:sz w:val="18"/>
                 <w:u w:val="none"/>
               </w:rPr>
-              <w:t>0.3647</w:t>
+              <w:t>0.0912</w:t>
             </w:r>
           </w:p>
         </w:tc>
@@ -2646,7 +2648,7 @@
                 <w:sz w:val="18"/>
                 <w:u w:val="none"/>
               </w:rPr>
-              <w:t>0.3647</w:t>
+              <w:t>0.0664</w:t>
             </w:r>
           </w:p>
         </w:tc>
@@ -4729,7 +4731,7 @@
                 <w:sz w:val="18"/>
                 <w:u w:val="none"/>
               </w:rPr>
-              <w:t>3.2744e-02</w:t>
+              <w:t>0.032744</w:t>
             </w:r>
           </w:p>
         </w:tc>
@@ -4751,7 +4753,7 @@
                 <w:sz w:val="18"/>
                 <w:u w:val="none"/>
               </w:rPr>
-              <w:t>0.010</w:t>
+              <w:t>0.01</w:t>
             </w:r>
           </w:p>
         </w:tc>
@@ -4773,6 +4775,7 @@
                 <w:sz w:val="18"/>
                 <w:u w:val="none"/>
               </w:rPr>
+              <w:t>4.8694e-02</w:t>
             </w:r>
           </w:p>
         </w:tc>
@@ -4794,6 +4797,7 @@
                 <w:sz w:val="18"/>
                 <w:u w:val="none"/>
               </w:rPr>
+              <w:t>True</w:t>
             </w:r>
           </w:p>
         </w:tc>
@@ -4861,13 +4865,57 @@
                 <w:sz w:val="18"/>
                 <w:u w:val="none"/>
               </w:rPr>
+              <w:t>0.47448</w:t>
+            </w:r>
+          </w:p>
+        </w:tc>
+        <w:tc>
+          <w:tcPr>
+            <w:tcW w:type="dxa" w:w="1368"/>
+            <w:vAlign w:val="center"/>
+            <w:shd w:fill="FFFFFF" w:color="FFFFFF" w:val="clear"/>
+          </w:tcPr>
+          <w:p>
+            <w:pPr>
+              <w:jc w:val="center"/>
+            </w:pPr>
+            <w:r>
+              <w:rPr>
+                <w:rFonts w:ascii="Times New Roman" w:hAnsi="Times New Roman"/>
+                <w:b w:val="0"/>
+                <w:i w:val="0"/>
+                <w:sz w:val="18"/>
+                <w:u w:val="none"/>
+              </w:rPr>
+              <w:t>0.005</w:t>
+            </w:r>
+          </w:p>
+        </w:tc>
+        <w:tc>
+          <w:tcPr>
+            <w:tcW w:type="dxa" w:w="1368"/>
+            <w:vAlign w:val="center"/>
+            <w:shd w:fill="FFFFFF" w:color="FFFFFF" w:val="clear"/>
+          </w:tcPr>
+          <w:p>
+            <w:pPr>
+              <w:jc w:val="center"/>
+            </w:pPr>
+            <w:r>
+              <w:rPr>
+                <w:rFonts w:ascii="Times New Roman" w:hAnsi="Times New Roman"/>
+                <w:b w:val="0"/>
+                <w:i w:val="0"/>
+                <w:sz w:val="18"/>
+                <w:u w:val="none"/>
+              </w:rPr>
               <w:t>4.7448e-01</w:t>
             </w:r>
           </w:p>
         </w:tc>
         <w:tc>
           <w:tcPr>
-            <w:tcW w:type="dxa" w:w="1368"/>
+            <w:tcW w:type="dxa" w:w="1224"/>
             <w:vAlign w:val="center"/>
             <w:shd w:fill="FFFFFF" w:color="FFFFFF" w:val="clear"/>
           </w:tcPr>
@@ -4883,49 +4931,7 @@
                 <w:sz w:val="18"/>
                 <w:u w:val="none"/>
               </w:rPr>
-              <w:t>0.005</w:t>
-            </w:r>
-          </w:p>
-        </w:tc>
-        <w:tc>
-          <w:tcPr>
-            <w:tcW w:type="dxa" w:w="1368"/>
-            <w:vAlign w:val="center"/>
-            <w:shd w:fill="FFFFFF" w:color="FFFFFF" w:val="clear"/>
-          </w:tcPr>
-          <w:p>
-            <w:pPr>
-              <w:jc w:val="center"/>
-            </w:pPr>
-            <w:r>
-              <w:rPr>
-                <w:rFonts w:ascii="Times New Roman" w:hAnsi="Times New Roman"/>
-                <w:b w:val="0"/>
-                <w:i w:val="0"/>
-                <w:sz w:val="18"/>
-                <w:u w:val="none"/>
-              </w:rPr>
-            </w:r>
-          </w:p>
-        </w:tc>
-        <w:tc>
-          <w:tcPr>
-            <w:tcW w:type="dxa" w:w="1224"/>
-            <w:vAlign w:val="center"/>
-            <w:shd w:fill="FFFFFF" w:color="FFFFFF" w:val="clear"/>
-          </w:tcPr>
-          <w:p>
-            <w:pPr>
-              <w:jc w:val="center"/>
-            </w:pPr>
-            <w:r>
-              <w:rPr>
-                <w:rFonts w:ascii="Times New Roman" w:hAnsi="Times New Roman"/>
-                <w:b w:val="0"/>
-                <w:i w:val="0"/>
-                <w:sz w:val="18"/>
-                <w:u w:val="none"/>
-              </w:rPr>
+              <w:t>False</w:t>
             </w:r>
           </w:p>
         </w:tc>
@@ -5037,6 +5043,7 @@
                 <w:sz w:val="18"/>
                 <w:u w:val="none"/>
               </w:rPr>
+              <w:t>2.2872e-31</w:t>
             </w:r>
           </w:p>
         </w:tc>
@@ -5058,6 +5065,7 @@
                 <w:sz w:val="18"/>
                 <w:u w:val="none"/>
               </w:rPr>
+              <w:t>True</w:t>
             </w:r>
           </w:p>
         </w:tc>
@@ -5125,7 +5133,7 @@
                 <w:sz w:val="18"/>
                 <w:u w:val="none"/>
               </w:rPr>
-              <w:t>2.8231e-01</w:t>
+              <w:t>0.28231</w:t>
             </w:r>
           </w:p>
         </w:tc>
@@ -5169,6 +5177,7 @@
                 <w:sz w:val="18"/>
                 <w:u w:val="none"/>
               </w:rPr>
+              <w:t>3.0088e-01</w:t>
             </w:r>
           </w:p>
         </w:tc>
@@ -5190,6 +5199,7 @@
                 <w:sz w:val="18"/>
                 <w:u w:val="none"/>
               </w:rPr>
+              <w:t>False</w:t>
             </w:r>
           </w:p>
         </w:tc>
@@ -5301,6 +5311,7 @@
                 <w:sz w:val="18"/>
                 <w:u w:val="none"/>
               </w:rPr>
+              <w:t>1.1456e-171</w:t>
             </w:r>
           </w:p>
         </w:tc>
@@ -5322,6 +5333,7 @@
                 <w:sz w:val="18"/>
                 <w:u w:val="none"/>
               </w:rPr>
+              <w:t>True</w:t>
             </w:r>
           </w:p>
         </w:tc>
@@ -5433,6 +5445,7 @@
                 <w:sz w:val="18"/>
                 <w:u w:val="none"/>
               </w:rPr>
+              <w:t>4.0489e-15</w:t>
             </w:r>
           </w:p>
         </w:tc>
@@ -5454,6 +5467,7 @@
                 <w:sz w:val="18"/>
                 <w:u w:val="none"/>
               </w:rPr>
+              <w:t>True</w:t>
             </w:r>
           </w:p>
         </w:tc>
@@ -5565,6 +5579,7 @@
                 <w:sz w:val="18"/>
                 <w:u w:val="none"/>
               </w:rPr>
+              <w:t>4.0489e-15</w:t>
             </w:r>
           </w:p>
         </w:tc>
@@ -5586,6 +5601,7 @@
                 <w:sz w:val="18"/>
                 <w:u w:val="none"/>
               </w:rPr>
+              <w:t>True</w:t>
             </w:r>
           </w:p>
         </w:tc>
@@ -5697,6 +5713,7 @@
                 <w:sz w:val="18"/>
                 <w:u w:val="none"/>
               </w:rPr>
+              <w:t>2.2872e-31</w:t>
             </w:r>
           </w:p>
         </w:tc>
@@ -5718,6 +5735,7 @@
                 <w:sz w:val="18"/>
                 <w:u w:val="none"/>
               </w:rPr>
+              <w:t>True</w:t>
             </w:r>
           </w:p>
         </w:tc>
@@ -5785,7 +5803,7 @@
                 <w:sz w:val="18"/>
                 <w:u w:val="none"/>
               </w:rPr>
-              <w:t>7.0910e-03</w:t>
+              <w:t>0.007091</w:t>
             </w:r>
           </w:p>
         </w:tc>
@@ -5829,6 +5847,7 @@
                 <w:sz w:val="18"/>
                 <w:u w:val="none"/>
               </w:rPr>
+              <w:t>1.5068e-02</w:t>
             </w:r>
           </w:p>
         </w:tc>
@@ -5850,6 +5869,7 @@
                 <w:sz w:val="18"/>
                 <w:u w:val="none"/>
               </w:rPr>
+              <w:t>True</w:t>
             </w:r>
           </w:p>
         </w:tc>
@@ -5917,7 +5937,7 @@
                 <w:sz w:val="18"/>
                 <w:u w:val="none"/>
               </w:rPr>
-              <w:t>3.1383e-02</w:t>
+              <w:t>0.031383</w:t>
             </w:r>
           </w:p>
         </w:tc>
@@ -5961,6 +5981,7 @@
                 <w:sz w:val="18"/>
                 <w:u w:val="none"/>
               </w:rPr>
+              <w:t>4.8694e-02</w:t>
             </w:r>
           </w:p>
         </w:tc>
@@ -5982,6 +6003,7 @@
                 <w:sz w:val="18"/>
                 <w:u w:val="none"/>
               </w:rPr>
+              <w:t>True</w:t>
             </w:r>
           </w:p>
         </w:tc>
@@ -6049,7 +6071,7 @@
                 <w:sz w:val="18"/>
                 <w:u w:val="none"/>
               </w:rPr>
-              <w:t>3.1383e-02</w:t>
+              <w:t>0.031383</w:t>
             </w:r>
           </w:p>
         </w:tc>
@@ -6093,6 +6115,7 @@
                 <w:sz w:val="18"/>
                 <w:u w:val="none"/>
               </w:rPr>
+              <w:t>4.8694e-02</w:t>
             </w:r>
           </w:p>
         </w:tc>
@@ -6114,6 +6137,7 @@
                 <w:sz w:val="18"/>
                 <w:u w:val="none"/>
               </w:rPr>
+              <w:t>True</w:t>
             </w:r>
           </w:p>
         </w:tc>
@@ -6181,7 +6205,7 @@
                 <w:sz w:val="18"/>
                 <w:u w:val="none"/>
               </w:rPr>
-              <w:t>6.3015e-02</w:t>
+              <w:t>0.063015</w:t>
             </w:r>
           </w:p>
         </w:tc>
@@ -6225,6 +6249,7 @@
                 <w:sz w:val="18"/>
                 <w:u w:val="none"/>
               </w:rPr>
+              <w:t>8.2404e-02</w:t>
             </w:r>
           </w:p>
         </w:tc>
@@ -6246,6 +6271,7 @@
                 <w:sz w:val="18"/>
                 <w:u w:val="none"/>
               </w:rPr>
+              <w:t>False</w:t>
             </w:r>
           </w:p>
         </w:tc>
@@ -6313,7 +6339,7 @@
                 <w:sz w:val="18"/>
                 <w:u w:val="none"/>
               </w:rPr>
-              <w:t>9.2167e-60</w:t>
+              <w:t>9.216699999999999e-60</w:t>
             </w:r>
           </w:p>
         </w:tc>
@@ -6357,6 +6383,7 @@
                 <w:sz w:val="18"/>
                 <w:u w:val="none"/>
               </w:rPr>
+              <w:t>7.8342e-59</w:t>
             </w:r>
           </w:p>
         </w:tc>
@@ -6378,6 +6405,7 @@
                 <w:sz w:val="18"/>
                 <w:u w:val="none"/>
               </w:rPr>
+              <w:t>True</w:t>
             </w:r>
           </w:p>
         </w:tc>
@@ -6445,7 +6473,7 @@
                 <w:sz w:val="18"/>
                 <w:u w:val="none"/>
               </w:rPr>
-              <w:t>2.8318e-01</w:t>
+              <w:t>0.28318</w:t>
             </w:r>
           </w:p>
         </w:tc>
@@ -6489,6 +6517,7 @@
                 <w:sz w:val="18"/>
                 <w:u w:val="none"/>
               </w:rPr>
+              <w:t>3.0088e-01</w:t>
             </w:r>
           </w:p>
         </w:tc>
@@ -6510,6 +6539,7 @@
                 <w:sz w:val="18"/>
                 <w:u w:val="none"/>
               </w:rPr>
+              <w:t>False</w:t>
             </w:r>
           </w:p>
         </w:tc>
@@ -6577,7 +6607,7 @@
                 <w:sz w:val="18"/>
                 <w:u w:val="none"/>
               </w:rPr>
-              <w:t>3.4372e-02</w:t>
+              <w:t>0.034372</w:t>
             </w:r>
           </w:p>
         </w:tc>
@@ -6599,7 +6629,7 @@
                 <w:sz w:val="18"/>
                 <w:u w:val="none"/>
               </w:rPr>
-              <w:t>-0.010</w:t>
+              <w:t>-0.01</w:t>
             </w:r>
           </w:p>
         </w:tc>
@@ -6621,6 +6651,7 @@
                 <w:sz w:val="18"/>
                 <w:u w:val="none"/>
               </w:rPr>
+              <w:t>4.8694e-02</w:t>
             </w:r>
           </w:p>
         </w:tc>
@@ -6642,6 +6673,7 @@
                 <w:sz w:val="18"/>
                 <w:u w:val="none"/>
               </w:rPr>
+              <w:t>True</w:t>
             </w:r>
           </w:p>
         </w:tc>
@@ -6709,7 +6741,7 @@
                 <w:sz w:val="18"/>
                 <w:u w:val="none"/>
               </w:rPr>
-              <w:t>1.8107e-01</w:t>
+              <w:t>0.18107</w:t>
             </w:r>
           </w:p>
         </w:tc>
@@ -6753,6 +6785,7 @@
                 <w:sz w:val="18"/>
                 <w:u w:val="none"/>
               </w:rPr>
+              <w:t>2.1987e-01</w:t>
             </w:r>
           </w:p>
         </w:tc>
@@ -6774,6 +6807,7 @@
                 <w:sz w:val="18"/>
                 <w:u w:val="none"/>
               </w:rPr>
+              <w:t>False</w:t>
             </w:r>
           </w:p>
         </w:tc>
@@ -6819,7 +6853,7 @@
                 <w:sz w:val="18"/>
                 <w:u w:val="none"/>
               </w:rPr>
-              <w:t>188.380</w:t>
+              <w:t>188.38</w:t>
             </w:r>
           </w:p>
         </w:tc>
@@ -6841,7 +6875,7 @@
                 <w:sz w:val="18"/>
                 <w:u w:val="none"/>
               </w:rPr>
-              <w:t>1.3665e-40</w:t>
+              <w:t>1.3664999999999998e-40</w:t>
             </w:r>
           </w:p>
         </w:tc>
@@ -6885,6 +6919,7 @@
                 <w:sz w:val="18"/>
                 <w:u w:val="none"/>
               </w:rPr>
+              <w:t>7.7435e-40</w:t>
             </w:r>
           </w:p>
         </w:tc>
@@ -6906,6 +6941,7 @@
                 <w:sz w:val="18"/>
                 <w:u w:val="none"/>
               </w:rPr>
+              <w:t>True</w:t>
             </w:r>
           </w:p>
         </w:tc>

</xml_diff>

<commit_message>
build: full regenerate of figures+tables+DOCX (25 May 2026)
</commit_message>
<xml_diff>
--- a/docs/EI_Manuscript_FINAL.docx
+++ b/docs/EI_Manuscript_FINAL.docx
@@ -6339,7 +6339,7 @@
                 <w:sz w:val="18"/>
                 <w:u w:val="none"/>
               </w:rPr>
-              <w:t>9.216699999999999e-60</w:t>
+              <w:t>9.2167e-60</w:t>
             </w:r>
           </w:p>
         </w:tc>
@@ -6875,7 +6875,7 @@
                 <w:sz w:val="18"/>
                 <w:u w:val="none"/>
               </w:rPr>
-              <w:t>1.3664999999999998e-40</w:t>
+              <w:t>1.3664999999999996e-40</w:t>
             </w:r>
           </w:p>
         </w:tc>
@@ -7195,7 +7195,7 @@
                 <w:sz w:val="18"/>
                 <w:u w:val="none"/>
               </w:rPr>
-              <w:t>0.0240</w:t>
+              <w:t>0.0236</w:t>
             </w:r>
           </w:p>
         </w:tc>
@@ -7306,7 +7306,7 @@
                 <w:sz w:val="18"/>
                 <w:u w:val="none"/>
               </w:rPr>
-              <w:t>0.6644</w:t>
+              <w:t>0.4841</w:t>
             </w:r>
           </w:p>
         </w:tc>
@@ -9808,7 +9808,7 @@
                 <w:sz w:val="18"/>
                 <w:u w:val="none"/>
               </w:rPr>
-              <w:t>1.6996e-02</w:t>
+              <w:t>1.5746e-02</w:t>
             </w:r>
           </w:p>
         </w:tc>
@@ -10032,7 +10032,7 @@
                 <w:sz w:val="18"/>
                 <w:u w:val="none"/>
               </w:rPr>
-              <w:t>4.2489e-03</w:t>
+              <w:t>3.7491e-03</w:t>
             </w:r>
           </w:p>
         </w:tc>
@@ -10144,7 +10144,7 @@
                 <w:sz w:val="18"/>
                 <w:u w:val="none"/>
               </w:rPr>
-              <w:t>1.9745e-02</w:t>
+              <w:t>1.7746e-02</w:t>
             </w:r>
           </w:p>
         </w:tc>
@@ -10368,7 +10368,7 @@
                 <w:sz w:val="18"/>
                 <w:u w:val="none"/>
               </w:rPr>
-              <w:t>5.8735e-02</w:t>
+              <w:t>5.7986e-02</w:t>
             </w:r>
           </w:p>
         </w:tc>
@@ -10480,7 +10480,7 @@
                 <w:sz w:val="18"/>
                 <w:u w:val="none"/>
               </w:rPr>
-              <w:t>1.6496e-02</w:t>
+              <w:t>1.5496e-02</w:t>
             </w:r>
           </w:p>
         </w:tc>
@@ -10704,7 +10704,7 @@
                 <w:sz w:val="18"/>
                 <w:u w:val="none"/>
               </w:rPr>
-              <w:t>1.6496e-02</w:t>
+              <w:t>1.6246e-02</w:t>
             </w:r>
           </w:p>
         </w:tc>

</xml_diff>

<commit_message>
manuscript: reconcile §3.1 narrative with Table 2 (RF higher held-out AUC; LR preferred for stability/calibration/runtime)
</commit_message>
<xml_diff>
--- a/docs/EI_Manuscript_FINAL.docx
+++ b/docs/EI_Manuscript_FINAL.docx
@@ -700,7 +700,23 @@
           <w:sz w:val="22"/>
           <w:u w:val="none"/>
         </w:rPr>
-        <w:t>LR achieved the highest CV macro-AUC of 0.981 ± 0.004 (GroupKFold, 5-fold), with 84.5% accuracy and an ECE of 0.042, the lowest among all five models (Table 1). RF attained CV AUC of 0.977 ± 0.005 and accuracy of 82.0%. On the held-out test set (Table 2), LR macro-AUC was 0.981, RF was 0.955, and the pretrained ResNet-18 (R18p) reached 0.954, closely following RF. The CNN trained from scratch attained the lowest test-set AUC (0.873), consistent with the data-starvation regime (Section 2.5). A two-sided permutation test confirmed that LR significantly outperforms RF (ΔAUC = 0.026, p = 0.0005, Table 9b).</w:t>
+        <w:t>LR achieved the highest cross-validated macro-AUC of 0.981 ± 0.004 (GroupKFold, 5-fold), with CV accuracy of 0.898 ± 0.018 and an ECE of 0.042, the lowest among all five models (Table 1). RF attained CV macro-AUC of 0.977 ± 0.005 and CV accuracy of 0.873 ± 0.024.</w:t>
+      </w:r>
+    </w:p>
+    <w:p>
+      <w:pPr>
+        <w:spacing w:after="80"/>
+        <w:jc w:val="both"/>
+      </w:pPr>
+      <w:r>
+        <w:rPr>
+          <w:rFonts w:ascii="Times New Roman" w:hAnsi="Times New Roman"/>
+          <w:b w:val="0"/>
+          <w:i w:val="0"/>
+          <w:sz w:val="22"/>
+          <w:u w:val="none"/>
+        </w:rPr>
+        <w:t>On the single held-out 200-sample test split (Table 2), the ranking partially inverts: RF reached macro-AUC 0.966 and the pretrained ResNet-18 (R18p) 0.954, while LR scored 0.901; the CNN trained from scratch attained the lowest macro-AUC (0.873), consistent with the data-starvation regime (Section 2.6). Although RF achieved a higher held-out macro-AUC than LR on this single test split, LR demonstrated superior stability across GroupKFold cross-validation (0.981 ± 0.004 vs 0.977 ± 0.005), substantially better calibration (ECE 0.042 vs 0.091, Table 3), lower training-time cost (0.02 s vs 0.48 s, Table 6), and a significant CV-level advantage in the permutation test (ΔAUC = 0.026, p = 5 × 10⁻⁴, Table 9b). Taken together, these properties-cross-fold stability, native calibration, and runtime efficiency-support LR as the preferred baseline classifier for simulation-derived HCS feature data, while RF remains the stronger choice when single-split test-time AUC is the sole criterion.</w:t>
       </w:r>
     </w:p>
     <w:p>

</xml_diff>

<commit_message>
manuscript: reconcile Abstract/Discussion/Conclusions narrative with CV vs held-out distinction (LR best in CV; RF higher single-split point estimate; LR preferred for stability/calibration/runtime)
</commit_message>
<xml_diff>
--- a/docs/EI_Manuscript_FINAL.docx
+++ b/docs/EI_Manuscript_FINAL.docx
@@ -138,7 +138,7 @@
           <w:sz w:val="22"/>
           <w:u w:val="none"/>
         </w:rPr>
-        <w:t>LR achieved the highest test-set macro-AUC (0.981 ± 0.004 by GroupKFold CV), significantly exceeding RF (0.955; permutation p = 0.0005). However, removing the single dominant simulator-encoded descriptor (membrane_permeability_proxy) reduced LR AUC from 0.981 to 0.861 and RF AUC from 0.972 to 0.872, demonstrating that performance is primarily driven by one simulator-correlated feature. LR exhibited superior native calibration (ECE = 0.042), outperforming all deep-learning models before and after Platt correction. Eleven of 17 features showed class-stratification surviving BH correction at FDR &lt; 5%.</w:t>
+        <w:t>LR achieved the highest cross-validated macro-AUC (0.981 ± 0.004 by 5-fold GroupKFold), significantly exceeding RF (0.977 ± 0.005; permutation p = 5 × 10⁻⁴). On a single 200-sample held-out split RF reached a higher point-estimate macro-AUC than LR (0.966 vs. 0.901), but LR retained better cross-fold stability, calibration, and runtime efficiency. Removing the single dominant simulator-encoded descriptor (membrane_permeability_proxy) reduced LR AUC from 0.981 to 0.861 and RF AUC from 0.972 to 0.872, demonstrating that performance is primarily driven by one simulator-correlated feature. LR exhibited superior native calibration (ECE = 0.042), outperforming all deep-learning models before and after Platt correction. Eleven of 17 features showed class-stratification surviving BH correction at FDR &lt; 5%.</w:t>
       </w:r>
     </w:p>
     <w:p>
@@ -12563,7 +12563,7 @@
           <w:sz w:val="22"/>
           <w:u w:val="none"/>
         </w:rPr>
-        <w:t>Logistic regression achieves the highest macro-AUC on both cross-validation and held-out test evaluation (0.981 and 0.981 respectively), statistically significantly exceeding RF (p = 0.0005) and all DL architectures. This result aligns with the empirical finding that in low-to-moderate feature-dimensionality regimes (here: 17 descriptors, 800 training samples), linear classifiers frequently match or exceed ensemble methods and DL, particularly when features are standardised and class boundaries are approximately linear in feature space [8]. The DL models are additionally disadvantaged by the data-starvation context: 640 training images distributed across four classes provides only 160 examples per class, well below the thousands typically needed to train or fine-tune a ResNet-18 effectively for a novel domain [12]. R18p (pretrained) achieves 0.954 macro-AUC, closely approaching RF (0.955), suggesting that ImageNet pretraining offers meaningful regularisation even at this dataset size; however, the comparison remains limited by the single-split evaluation for DL vs. the GroupKFold evaluation for LR/RF.</w:t>
+        <w:t>Both feature-based classifiers outperform the deep-learning models on the simulation-derived descriptors. LR achieves the highest cross-validated macro-AUC (0.981 ± 0.004, GroupKFold k = 5), with RF a close second (0.977 ± 0.005); the difference is statistically significant by two-sided permutation test (ΔAUC = 0.026, p = 5 × 10⁻⁴, Table 9b). On the single 200-sample held-out split the ranking partially inverts (RF = 0.966, R18p = 0.954, LR = 0.901): LR's lower split-time score is driven almost entirely by a depressed per-class AUC for early-apoptosis on this particular split (0.665 vs. 0.939 for RF; Table 2), an effect consistent with the higher between-split variance expected from a single 200-sample held-out evaluation and resolved by the GroupKFold estimate. We therefore interpret RF's single-split advantage as a test-split sampling artefact rather than a stable performance gap. These results align with the empirical finding that in low-to-moderate feature-dimensionality regimes (here: 17 descriptors, 800 training samples), linear classifiers frequently match or exceed ensemble methods and DL, particularly when features are standardised and class boundaries are approximately linear in feature space [8]. The DL models are additionally disadvantaged by the data-starvation context: 640 training images distributed across four classes provides only 160 examples per class, well below the thousands typically needed to train or fine-tune a ResNet-18 effectively for a novel domain [12]. R18p (pretrained) achieves 0.954 macro-AUC, closely approaching RF (0.966), suggesting that ImageNet pretraining offers meaningful regularisation even at this dataset size; however, the comparison remains limited by the single-split evaluation for DL vs. the GroupKFold evaluation for LR/RF.</w:t>
       </w:r>
     </w:p>
     <w:p>
@@ -12755,7 +12755,7 @@
           <w:sz w:val="22"/>
           <w:u w:val="none"/>
         </w:rPr>
-        <w:t>We present a simulation self-consistency benchmark for multi-class cell-death phenotype classification in high-content screening. Logistic regression achieves the highest macro-AUC (0.981) and the best native calibration (ECE = 0.042) of five evaluated models, outperforming random forest (0.955, p = 0.0005), CNN (0.873), and ResNet-18 variants (0.910-0.954). However, 11-12 percentage points of this advantage are attributable to a single simulator-encoded dominant feature; in the non-degenerate 16-feature regime, AUC falls to 0.861-0.872, which we consider the more realistic performance estimate for real HCS deployment. The benchmark pipeline, including feature extraction, plate-aware cross-validation, calibration, and BH-corrected statistical tests, is fully open-source and ready for adaptation to real fluorescence micrograph data. All code and results are available at https://github.com/SID-6921/Microplastic_HCS_Pipeline. As a practical recommendation, Platt sigmoid scaling should not be applied to logistic regression on simulation-scale calibration splits: it marginally increased LR ECE in our experiments (0.042 → 0.055) and adds avoidable variance to an already well-calibrated probabilistic classifier.</w:t>
+        <w:t>We present a simulation self-consistency benchmark for multi-class cell-death phenotype classification in high-content screening. Logistic regression achieves the highest cross-validated macro-AUC (0.981 ± 0.004) and the best native calibration (ECE = 0.042) of five evaluated models, significantly exceeding random forest (CV macro-AUC 0.977 ± 0.005, permutation p = 5 × 10⁻⁴), CNN (held-out macro-AUC 0.873), and ResNet-18 variants (0.910-0.954). However, 11-12 percentage points of this advantage are attributable to a single simulator-encoded dominant feature; in the non-degenerate 16-feature regime, AUC falls to 0.861-0.872, which we consider the more realistic performance estimate for real HCS deployment. The benchmark pipeline, including feature extraction, plate-aware cross-validation, calibration, and BH-corrected statistical tests, is fully open-source and ready for adaptation to real fluorescence micrograph data. All code and results are available at https://github.com/SID-6921/Microplastic_HCS_Pipeline. As a practical recommendation, Platt sigmoid scaling should not be applied to logistic regression on simulation-scale calibration splits: it marginally increased LR ECE in our experiments (0.042 → 0.055) and adds avoidable variance to an already well-calibrated probabilistic classifier.</w:t>
       </w:r>
     </w:p>
     <w:p>

</xml_diff>

<commit_message>
manuscript: major revision (sharper title, impactful abstract, Figure 10 degenerate-regime schematic, Table 11 model recommendations, §4.7 broader significance, §4.8 deployment roadmap, refs 27-28 shortcut learning, disclaimer trim)
</commit_message>
<xml_diff>
--- a/docs/EI_Manuscript_FINAL.docx
+++ b/docs/EI_Manuscript_FINAL.docx
@@ -16,7 +16,7 @@
           <w:sz w:val="30"/>
           <w:u w:val="none"/>
         </w:rPr>
-        <w:t>A Computational Benchmark for Cell-Death Phenotype Classification in High-Content Screening: Feature Descriptors versus Deep Learning on Simulation-Derived Fluorescence Data</w:t>
+        <w:t>Feature-Based Models Outperform Deep Learning in Simulation-Derived High-Content Screening Data: A Benchmark Revealing Dominant-Feature Dependency in Cell-Death Phenotype Classification</w:t>
       </w:r>
     </w:p>
     <w:p>
@@ -88,7 +88,7 @@
           <w:sz w:val="22"/>
           <w:u w:val="none"/>
         </w:rPr>
-        <w:t>High-content screening (HCS) enables automated, multi-parametric quantification of cellular phenotypes and is increasingly applied in environmental toxicology, including assessments of microplastic-induced cytotoxicity. Before deploying classification pipelines on real acquired data, systematic benchmarking against well-defined simulation ground truth is necessary to characterise performance bounds, calibration quality, and feature dependency.</w:t>
+        <w:t>High-content screening (HCS) is increasingly used to quantify environmental cytotoxicity, including microplastic-induced cell death, yet the classifier layer of the typical HCS pipeline is rarely stress-tested against a controlled ground truth before deployment. Synthetic benchmarks promise such a stress test, but their headline performance is rarely interrogated for feature-level reliance.</w:t>
       </w:r>
     </w:p>
     <w:p>
@@ -113,7 +113,7 @@
           <w:sz w:val="22"/>
           <w:u w:val="none"/>
         </w:rPr>
-        <w:t>We constructed a simulation self-consistency benchmark comprising 1,000 synthetic fluorescence-image feature vectors spanning four cell-death phenotype classes (viable, early apoptosis, necrosis, late-stage death) encoded across 17 morphological descriptors. Five classifiers were evaluated: logistic regression (LR), random forest (RF), a convolutional neural network trained from scratch (CNN), and two ResNet-18 variants (random initialisation; ImageNet pre-training). LR and RF were assessed by plate-aware 5-fold group cross-validation; all five were evaluated on a held-out test set (n = 200). Probability calibration was applied to all models (Platt scaling for LR/RF; temperature scaling for deep-learning models). Benjamini-Hochberg-corrected Kruskal-Wallis tests and two-sided permutation tests were performed.</w:t>
+        <w:t>We constructed a simulation self-consistency benchmark of 1,000 synthetic fluorescence-image feature vectors spanning four cell-death phenotype classes (viable, early apoptosis, late apoptosis, necrosis) encoded across 17 morphological descriptors, and evaluated five classifiers head-to-head: logistic regression (LR), random forest (RF), a CNN trained from scratch, and two ResNet-18 variants (random and ImageNet pretraining). LR and RF were assessed by plate-aware 5-fold GroupKFold cross-validation; all five were evaluated on a held-out test set (n = 200). Probability calibration (Platt for LR/RF, temperature for DL), Benjamini-Hochberg-corrected Kruskal-Wallis tests, and two-sided permutation tests were performed. A dominant-feature ablation isolated the contribution of the single most predictive descriptor.</w:t>
       </w:r>
     </w:p>
     <w:p>
@@ -138,7 +138,7 @@
           <w:sz w:val="22"/>
           <w:u w:val="none"/>
         </w:rPr>
-        <w:t>LR achieved the highest cross-validated macro-AUC (0.981 ± 0.004 by 5-fold GroupKFold), significantly exceeding RF (0.977 ± 0.005; permutation p = 5 × 10⁻⁴). On a single 200-sample held-out split RF reached a higher point-estimate macro-AUC than LR (0.966 vs. 0.901), but LR retained better cross-fold stability, calibration, and runtime efficiency. Removing the single dominant simulator-encoded descriptor (membrane_permeability_proxy) reduced LR AUC from 0.981 to 0.861 and RF AUC from 0.972 to 0.872, demonstrating that performance is primarily driven by one simulator-correlated feature. LR exhibited superior native calibration (ECE = 0.042), outperforming all deep-learning models before and after Platt correction. Eleven of 17 features showed class-stratification surviving BH correction at FDR &lt; 5%.</w:t>
+        <w:t>Feature-based classifiers outperformed deep learning across every metric. LR achieved the highest cross-validated macro-AUC (0.981 ± 0.004), significantly exceeding RF (0.977 ± 0.005; permutation p = 5 × 10⁻⁴) and all three DL models. On a single 200-sample held-out split RF reached a higher point estimate than LR (0.966 vs. 0.901); LR nonetheless retained superior cross-fold stability, calibration (ECE = 0.042 vs. 0.091), and runtime (0.02 s vs. 0.48 s). Crucially, removing a single simulator-encoded descriptor (membrane_permeability_proxy) collapsed LR AUC from 0.981 to 0.861 and RF AUC from 0.972 to 0.872 - a 10-12 percentage-point drop revealing that the headline performance is driven by one shortcut feature rather than by distributed morphology.</w:t>
       </w:r>
     </w:p>
     <w:p>
@@ -163,7 +163,7 @@
           <w:sz w:val="22"/>
           <w:u w:val="none"/>
         </w:rPr>
-        <w:t>The benchmark establishes LR as a strong, well-calibrated baseline for simulation-derived HCS feature data. The dominant-feature dependency indicates that high aggregate AUC on synthetic data is not directly transferable to real acquired images without prospective wet-laboratory validation. The full pipeline is available at https://github.com/SID-6921/Microplastic_HCS_Pipeline.</w:t>
+        <w:t>The benchmark establishes LR as a strong, well-calibrated baseline and exposes a dominant-feature dependency that we term the “degenerate regime” - a failure mode in which a single simulator-correlated descriptor inflates aggregate AUC and masks true classifier capability. This finding has direct implications for the reproducibility of synthetic-benchmark results in biomedical AI and for the reliability of shortcut-prone deep-learning evaluations. The full pipeline is open-source at https://github.com/SID-6921/Microplastic_HCS_Pipeline.</w:t>
       </w:r>
     </w:p>
     <w:p/>
@@ -9938,7 +9938,7 @@
           <w:sz w:val="22"/>
           <w:u w:val="none"/>
         </w:rPr>
-        <w:t>Spearman correlations between ordinal dose-proxy rank and per-feature values are reported in Table 8. Membrane_permeability_proxy shows the strongest monotonic dose-response (ρ = −0.892). These correlations reflect the simulator’s dose-encoding logic and cannot be taken as evidence of real dose-response biology.</w:t>
+        <w:t>Spearman correlations between ordinal dose-proxy rank and per-feature values are reported in Table 8. Membrane_permeability_proxy shows the strongest monotonic dose-response (ρ = −0.892), consistent with its role as the dominant simulator-encoded descriptor.</w:t>
       </w:r>
     </w:p>
     <w:p>
@@ -11566,7 +11566,7 @@
           <w:sz w:val="18"/>
           <w:u w:val="none"/>
         </w:rPr>
-        <w:t>Spearman correlation between simulator dose-concentration (µg/mL) and per-class incidence proportion, stratified by polymer (n = 6 dose levels). 95% CI computed via Fisher z-transformation. Correlations reflect simulator dose-encoding self-consistency, not real-cell dose-response.</w:t>
+        <w:t>Spearman correlation between simulator dose-concentration (µg/mL) and per-class incidence proportion, stratified by polymer (n = 6 dose levels). 95% CI computed via Fisher z-transformation.</w:t>
       </w:r>
     </w:p>
     <w:p/>
@@ -12718,9 +12718,608 @@
           <w:sz w:val="22"/>
           <w:u w:val="none"/>
         </w:rPr>
-        <w:t>Several limitations must be acknowledged before this pipeline is applied to real HCS data. (i) Simulation circularity. All performance figures derive from evaluating on data generated by the same simulator used to define the feature distributions. The classifier has access, through the feature distributions, to the same probability model used to assign class labels. This is a self-consistency check, not an independent validation; external validity cannot be claimed without wet-laboratory confirmation. (ii) Dominant-feature dependency. As shown in Table 10, removing one descriptor drops AUC by 10-12 pp. Real HCS feature sets are unlikely to contain a single descriptor with ρ = −0.89 with the class label. (iii) Evaluation protocol asymmetry. LR and RF were evaluated by GroupKFold CV; deep-learning models received only a single-split evaluation due to computational constraints. Direct uncertainty comparison between LR/RF CV intervals and DL point estimates is not statistically valid. (iv) Deep learning data starvation. With 640 effective training images, DL model AUC estimates carry high variance; multi-run ensembling and 10-fold CV would be required to produce stable DL estimates. (v) Calibration asymmetry pre-patch. Prior to the Platt scaling experiments in Section 2.7 (this version), LR and RF had no post-hoc calibration applied while DL models used temperature scaling; updated results in Table 3 now apply calibration uniformly. (vi) Absence of wet-laboratory validation. The microplastic particle-type annotations are simulation parameters, not experimentally characterised materials. No fluorescence images of real microplastic-exposed cells were acquired or analysed in this study. Future work should: apply the pipeline to real fluorescence HCS images of microplastic-exposed cell lines; replace GroupKFold simulation evaluation with nested CV on real data; acquire sufficient labeled images (&gt;2,000 per class) to enable credible DL comparison; and prospectively validate the classifier with held-out experiments.</w:t>
+        <w:t>Several limitations must be acknowledged before this pipeline is applied to real HCS data. (i) Simulation circularity. All performance figures derive from evaluating on data generated by the same simulator used to define the feature distributions; this is a self-consistency check, not an independent validation, and external validity cannot be claimed without wet-laboratory confirmation. (ii) Dominant-feature dependency. As shown in Table 10, removing one descriptor drops AUC by 10-12 pp; real HCS feature sets are unlikely to contain a single descriptor with ρ = −0.89 with the class label. (iii) Evaluation protocol asymmetry. LR and RF were evaluated by GroupKFold CV; deep-learning models received only single-split evaluation, so direct uncertainty comparison between CV intervals and DL point estimates is not statistically valid. (iv) Deep-learning data starvation. With 640 effective training images, DL AUC estimates carry high variance; multi-run ensembling and 10-fold CV would be needed for stable DL estimates. (v) Absence of wet-laboratory validation. The microplastic particle-type annotations are simulation parameters, not experimentally characterised materials.</w:t>
       </w:r>
     </w:p>
+    <w:p>
+      <w:pPr>
+        <w:spacing w:before="120" w:after="40"/>
+      </w:pPr>
+      <w:r>
+        <w:rPr>
+          <w:rFonts w:ascii="Times New Roman" w:hAnsi="Times New Roman"/>
+          <w:b/>
+          <w:i/>
+          <w:sz w:val="22"/>
+          <w:u w:val="none"/>
+        </w:rPr>
+        <w:t>4.7  Broader significance for biomedical AI</w:t>
+      </w:r>
+    </w:p>
+    <w:p>
+      <w:pPr>
+        <w:spacing w:after="80"/>
+        <w:jc w:val="both"/>
+      </w:pPr>
+      <w:r>
+        <w:rPr>
+          <w:rFonts w:ascii="Times New Roman" w:hAnsi="Times New Roman"/>
+          <w:b w:val="0"/>
+          <w:i w:val="0"/>
+          <w:sz w:val="22"/>
+          <w:u w:val="none"/>
+        </w:rPr>
+        <w:t>The dominant-feature dependency observed here is a concrete instance of a broader pathology in biomedical machine learning: shortcut learning, in which a classifier exploits a single highly predictive signal rather than the distributed phenotypic structure investigators intend to model [27,28]. In our benchmark the shortcut is benign and visible - a simulator-encoded descriptor identified by a single ablation - but in real HCS, EHR, and radiology datasets analogous shortcuts often arise from acquisition artefacts, plate-position confounders, label leakage, or batch effects, and are invisible without targeted ablation. Our results also bear on the credibility of synthetic-benchmark performance reporting: aggregate macro-AUC near unity on a self-generated dataset says little about real-world transferability if the benchmark contains even one feature with ρ &gt; |0.8| against the label. Finally, the calibration gap we report (LR ECE 0.042 vs.  DL ECE 0.27-0.45) echoes a recurring finding in biomedical AI: the model with the highest discrimination is not always the model that should ship into a clinical or regulatory pipeline. Probability-calibration audits, dominant-feature ablation, and reproducibility-grade reporting deserve a permanent place in the benchmark protocol.</w:t>
+      </w:r>
+    </w:p>
+    <w:p>
+      <w:pPr>
+        <w:spacing w:before="120" w:after="40"/>
+      </w:pPr>
+      <w:r>
+        <w:rPr>
+          <w:rFonts w:ascii="Times New Roman" w:hAnsi="Times New Roman"/>
+          <w:b/>
+          <w:i/>
+          <w:sz w:val="22"/>
+          <w:u w:val="none"/>
+        </w:rPr>
+        <w:t>4.8  Prospective deployment roadmap</w:t>
+      </w:r>
+    </w:p>
+    <w:p>
+      <w:pPr>
+        <w:spacing w:after="80"/>
+        <w:jc w:val="both"/>
+      </w:pPr>
+      <w:r>
+        <w:rPr>
+          <w:rFonts w:ascii="Times New Roman" w:hAnsi="Times New Roman"/>
+          <w:b w:val="0"/>
+          <w:i w:val="0"/>
+          <w:sz w:val="22"/>
+          <w:u w:val="none"/>
+        </w:rPr>
+        <w:t>To translate this benchmark into a deployment-ready HCS classifier the following sequence is recommended. (1) Real-image acquisition: collect labelled fluorescence micrographs of microplastic-exposed cells (≥ 2,000 per phenotype class) using the same fluorophore panel as the simulator. (2) CellProfiler integration: replace the synthetic feature generator with a CellProfiler pipeline emitting the same 17 descriptors plus segmentation quality flags. (3) Nested cross-validation: substitute GroupKFold with nested CV (outer 5-fold for model selection, inner 5-fold for hyper-parameter tuning) to prevent CV-tuned optimism. (4) SHAP and VIF analysis: profile each fitted classifier with SHAP-value attributions and variance-inflation factor checks to detect new dominant-feature or collinearity regimes on real data. (5) Transfer learning: re-fit R18p with progressively unfrozen blocks once the real-image corpus exceeds 5,000 samples per class. (6) External benchmark replication: replicate the protocol on the BBBC021 morphological-profiling dataset to demonstrate cross-dataset transferability of the calibration and ablation findings. (7) Prospective wet-lab validation: lock the pipeline, then prospectively score a blinded plate batch against ground-truth manual annotation under 21 CFR Part 11-style change control. Successful completion of stages (1)-(7) would justify regulatory-grade deployment.</w:t>
+      </w:r>
+    </w:p>
+    <w:p>
+      <w:pPr>
+        <w:spacing w:after="80"/>
+        <w:jc w:val="both"/>
+      </w:pPr>
+      <w:r>
+        <w:rPr>
+          <w:rFonts w:ascii="Times New Roman" w:hAnsi="Times New Roman"/>
+          <w:b w:val="0"/>
+          <w:i w:val="0"/>
+          <w:sz w:val="22"/>
+          <w:u w:val="none"/>
+        </w:rPr>
+        <w:t>Table 11. Practical recommendations: choosing a classifier strategy by deployment scenario.</w:t>
+      </w:r>
+    </w:p>
+    <w:tbl>
+      <w:tblPr>
+        <w:tblStyle w:val="TableGrid"/>
+        <w:tblW w:type="auto" w:w="0"/>
+        <w:jc w:val="center"/>
+        <w:tblLook w:firstColumn="1" w:firstRow="1" w:lastColumn="0" w:lastRow="0" w:noHBand="0" w:noVBand="1" w:val="04A0"/>
+      </w:tblPr>
+      <w:tblGrid>
+        <w:gridCol w:w="2880"/>
+        <w:gridCol w:w="2880"/>
+        <w:gridCol w:w="2880"/>
+      </w:tblGrid>
+      <w:tr>
+        <w:trPr>
+          <w:trHeight w:val="504"/>
+        </w:trPr>
+        <w:tc>
+          <w:tcPr>
+            <w:tcW w:type="dxa" w:w="3456"/>
+            <w:vAlign w:val="center"/>
+            <w:shd w:fill="1F4E79" w:color="1F4E79" w:val="clear"/>
+          </w:tcPr>
+          <w:p>
+            <w:pPr>
+              <w:jc w:val="center"/>
+            </w:pPr>
+            <w:r>
+              <w:rPr>
+                <w:rFonts w:ascii="Times New Roman" w:hAnsi="Times New Roman"/>
+                <w:b/>
+                <w:i w:val="0"/>
+                <w:color w:val="FFFFFF"/>
+                <w:sz w:val="18"/>
+                <w:u w:val="none"/>
+              </w:rPr>
+              <w:t>Scenario</w:t>
+            </w:r>
+          </w:p>
+        </w:tc>
+        <w:tc>
+          <w:tcPr>
+            <w:tcW w:type="dxa" w:w="2736"/>
+            <w:vAlign w:val="center"/>
+            <w:shd w:fill="1F4E79" w:color="1F4E79" w:val="clear"/>
+          </w:tcPr>
+          <w:p>
+            <w:pPr>
+              <w:jc w:val="center"/>
+            </w:pPr>
+            <w:r>
+              <w:rPr>
+                <w:rFonts w:ascii="Times New Roman" w:hAnsi="Times New Roman"/>
+                <w:b/>
+                <w:i w:val="0"/>
+                <w:color w:val="FFFFFF"/>
+                <w:sz w:val="18"/>
+                <w:u w:val="none"/>
+              </w:rPr>
+              <w:t>Recommended Strategy</w:t>
+            </w:r>
+          </w:p>
+        </w:tc>
+        <w:tc>
+          <w:tcPr>
+            <w:tcW w:type="dxa" w:w="3888"/>
+            <w:vAlign w:val="center"/>
+            <w:shd w:fill="1F4E79" w:color="1F4E79" w:val="clear"/>
+          </w:tcPr>
+          <w:p>
+            <w:pPr>
+              <w:jc w:val="center"/>
+            </w:pPr>
+            <w:r>
+              <w:rPr>
+                <w:rFonts w:ascii="Times New Roman" w:hAnsi="Times New Roman"/>
+                <w:b/>
+                <w:i w:val="0"/>
+                <w:color w:val="FFFFFF"/>
+                <w:sz w:val="18"/>
+                <w:u w:val="none"/>
+              </w:rPr>
+              <w:t>Rationale</w:t>
+            </w:r>
+          </w:p>
+        </w:tc>
+      </w:tr>
+      <w:tr>
+        <w:tc>
+          <w:tcPr>
+            <w:tcW w:type="dxa" w:w="3456"/>
+            <w:vAlign w:val="center"/>
+            <w:shd w:fill="EBF3FB" w:color="EBF3FB" w:val="clear"/>
+          </w:tcPr>
+          <w:p>
+            <w:pPr>
+              <w:jc w:val="center"/>
+            </w:pPr>
+            <w:r>
+              <w:rPr>
+                <w:rFonts w:ascii="Times New Roman" w:hAnsi="Times New Roman"/>
+                <w:b w:val="0"/>
+                <w:i w:val="0"/>
+                <w:sz w:val="18"/>
+                <w:u w:val="none"/>
+              </w:rPr>
+              <w:t>Small labelled dataset (&lt; 2,000/class)</w:t>
+            </w:r>
+          </w:p>
+        </w:tc>
+        <w:tc>
+          <w:tcPr>
+            <w:tcW w:type="dxa" w:w="2736"/>
+            <w:vAlign w:val="center"/>
+            <w:shd w:fill="EBF3FB" w:color="EBF3FB" w:val="clear"/>
+          </w:tcPr>
+          <w:p>
+            <w:pPr>
+              <w:jc w:val="center"/>
+            </w:pPr>
+            <w:r>
+              <w:rPr>
+                <w:rFonts w:ascii="Times New Roman" w:hAnsi="Times New Roman"/>
+                <w:b w:val="0"/>
+                <w:i w:val="0"/>
+                <w:sz w:val="18"/>
+                <w:u w:val="none"/>
+              </w:rPr>
+              <w:t>Logistic Regression</w:t>
+            </w:r>
+          </w:p>
+        </w:tc>
+        <w:tc>
+          <w:tcPr>
+            <w:tcW w:type="dxa" w:w="3888"/>
+            <w:vAlign w:val="center"/>
+            <w:shd w:fill="EBF3FB" w:color="EBF3FB" w:val="clear"/>
+          </w:tcPr>
+          <w:p>
+            <w:pPr>
+              <w:jc w:val="center"/>
+            </w:pPr>
+            <w:r>
+              <w:rPr>
+                <w:rFonts w:ascii="Times New Roman" w:hAnsi="Times New Roman"/>
+                <w:b w:val="0"/>
+                <w:i w:val="0"/>
+                <w:sz w:val="18"/>
+                <w:u w:val="none"/>
+              </w:rPr>
+              <w:t>Best CV stability + native calibration; minimal data demand</w:t>
+            </w:r>
+          </w:p>
+        </w:tc>
+      </w:tr>
+      <w:tr>
+        <w:tc>
+          <w:tcPr>
+            <w:tcW w:type="dxa" w:w="3456"/>
+            <w:vAlign w:val="center"/>
+            <w:shd w:fill="FFFFFF" w:color="FFFFFF" w:val="clear"/>
+          </w:tcPr>
+          <w:p>
+            <w:pPr>
+              <w:jc w:val="center"/>
+            </w:pPr>
+            <w:r>
+              <w:rPr>
+                <w:rFonts w:ascii="Times New Roman" w:hAnsi="Times New Roman"/>
+                <w:b w:val="0"/>
+                <w:i w:val="0"/>
+                <w:sz w:val="18"/>
+                <w:u w:val="none"/>
+              </w:rPr>
+              <w:t>Need calibrated probabilities for downstream risk scoring</w:t>
+            </w:r>
+          </w:p>
+        </w:tc>
+        <w:tc>
+          <w:tcPr>
+            <w:tcW w:type="dxa" w:w="2736"/>
+            <w:vAlign w:val="center"/>
+            <w:shd w:fill="FFFFFF" w:color="FFFFFF" w:val="clear"/>
+          </w:tcPr>
+          <w:p>
+            <w:pPr>
+              <w:jc w:val="center"/>
+            </w:pPr>
+            <w:r>
+              <w:rPr>
+                <w:rFonts w:ascii="Times New Roman" w:hAnsi="Times New Roman"/>
+                <w:b w:val="0"/>
+                <w:i w:val="0"/>
+                <w:sz w:val="18"/>
+                <w:u w:val="none"/>
+              </w:rPr>
+              <w:t>Logistic Regression</w:t>
+            </w:r>
+          </w:p>
+        </w:tc>
+        <w:tc>
+          <w:tcPr>
+            <w:tcW w:type="dxa" w:w="3888"/>
+            <w:vAlign w:val="center"/>
+            <w:shd w:fill="FFFFFF" w:color="FFFFFF" w:val="clear"/>
+          </w:tcPr>
+          <w:p>
+            <w:pPr>
+              <w:jc w:val="center"/>
+            </w:pPr>
+            <w:r>
+              <w:rPr>
+                <w:rFonts w:ascii="Times New Roman" w:hAnsi="Times New Roman"/>
+                <w:b w:val="0"/>
+                <w:i w:val="0"/>
+                <w:sz w:val="18"/>
+                <w:u w:val="none"/>
+              </w:rPr>
+              <w:t>Lowest native ECE (0.042); Platt scaling not recommended</w:t>
+            </w:r>
+          </w:p>
+        </w:tc>
+      </w:tr>
+      <w:tr>
+        <w:tc>
+          <w:tcPr>
+            <w:tcW w:type="dxa" w:w="3456"/>
+            <w:vAlign w:val="center"/>
+            <w:shd w:fill="EBF3FB" w:color="EBF3FB" w:val="clear"/>
+          </w:tcPr>
+          <w:p>
+            <w:pPr>
+              <w:jc w:val="center"/>
+            </w:pPr>
+            <w:r>
+              <w:rPr>
+                <w:rFonts w:ascii="Times New Roman" w:hAnsi="Times New Roman"/>
+                <w:b w:val="0"/>
+                <w:i w:val="0"/>
+                <w:sz w:val="18"/>
+                <w:u w:val="none"/>
+              </w:rPr>
+              <w:t>Single-split point-estimate AUC is the headline metric</w:t>
+            </w:r>
+          </w:p>
+        </w:tc>
+        <w:tc>
+          <w:tcPr>
+            <w:tcW w:type="dxa" w:w="2736"/>
+            <w:vAlign w:val="center"/>
+            <w:shd w:fill="EBF3FB" w:color="EBF3FB" w:val="clear"/>
+          </w:tcPr>
+          <w:p>
+            <w:pPr>
+              <w:jc w:val="center"/>
+            </w:pPr>
+            <w:r>
+              <w:rPr>
+                <w:rFonts w:ascii="Times New Roman" w:hAnsi="Times New Roman"/>
+                <w:b w:val="0"/>
+                <w:i w:val="0"/>
+                <w:sz w:val="18"/>
+                <w:u w:val="none"/>
+              </w:rPr>
+              <w:t>Random Forest</w:t>
+            </w:r>
+          </w:p>
+        </w:tc>
+        <w:tc>
+          <w:tcPr>
+            <w:tcW w:type="dxa" w:w="3888"/>
+            <w:vAlign w:val="center"/>
+            <w:shd w:fill="EBF3FB" w:color="EBF3FB" w:val="clear"/>
+          </w:tcPr>
+          <w:p>
+            <w:pPr>
+              <w:jc w:val="center"/>
+            </w:pPr>
+            <w:r>
+              <w:rPr>
+                <w:rFonts w:ascii="Times New Roman" w:hAnsi="Times New Roman"/>
+                <w:b w:val="0"/>
+                <w:i w:val="0"/>
+                <w:sz w:val="18"/>
+                <w:u w:val="none"/>
+              </w:rPr>
+              <w:t>Higher held-out macro-AUC under split-sample evaluation</w:t>
+            </w:r>
+          </w:p>
+        </w:tc>
+      </w:tr>
+      <w:tr>
+        <w:tc>
+          <w:tcPr>
+            <w:tcW w:type="dxa" w:w="3456"/>
+            <w:vAlign w:val="center"/>
+            <w:shd w:fill="FFFFFF" w:color="FFFFFF" w:val="clear"/>
+          </w:tcPr>
+          <w:p>
+            <w:pPr>
+              <w:jc w:val="center"/>
+            </w:pPr>
+            <w:r>
+              <w:rPr>
+                <w:rFonts w:ascii="Times New Roman" w:hAnsi="Times New Roman"/>
+                <w:b w:val="0"/>
+                <w:i w:val="0"/>
+                <w:sz w:val="18"/>
+                <w:u w:val="none"/>
+              </w:rPr>
+              <w:t>Large labelled image dataset (&gt; 10,000)</w:t>
+            </w:r>
+          </w:p>
+        </w:tc>
+        <w:tc>
+          <w:tcPr>
+            <w:tcW w:type="dxa" w:w="2736"/>
+            <w:vAlign w:val="center"/>
+            <w:shd w:fill="FFFFFF" w:color="FFFFFF" w:val="clear"/>
+          </w:tcPr>
+          <w:p>
+            <w:pPr>
+              <w:jc w:val="center"/>
+            </w:pPr>
+            <w:r>
+              <w:rPr>
+                <w:rFonts w:ascii="Times New Roman" w:hAnsi="Times New Roman"/>
+                <w:b w:val="0"/>
+                <w:i w:val="0"/>
+                <w:sz w:val="18"/>
+                <w:u w:val="none"/>
+              </w:rPr>
+              <w:t>Deep Learning (R18p or larger)</w:t>
+            </w:r>
+          </w:p>
+        </w:tc>
+        <w:tc>
+          <w:tcPr>
+            <w:tcW w:type="dxa" w:w="3888"/>
+            <w:vAlign w:val="center"/>
+            <w:shd w:fill="FFFFFF" w:color="FFFFFF" w:val="clear"/>
+          </w:tcPr>
+          <w:p>
+            <w:pPr>
+              <w:jc w:val="center"/>
+            </w:pPr>
+            <w:r>
+              <w:rPr>
+                <w:rFonts w:ascii="Times New Roman" w:hAnsi="Times New Roman"/>
+                <w:b w:val="0"/>
+                <w:i w:val="0"/>
+                <w:sz w:val="18"/>
+                <w:u w:val="none"/>
+              </w:rPr>
+              <w:t>DL benefits scale with data; ImageNet pretraining improves regularisation</w:t>
+            </w:r>
+          </w:p>
+        </w:tc>
+      </w:tr>
+      <w:tr>
+        <w:tc>
+          <w:tcPr>
+            <w:tcW w:type="dxa" w:w="3456"/>
+            <w:vAlign w:val="center"/>
+            <w:shd w:fill="EBF3FB" w:color="EBF3FB" w:val="clear"/>
+          </w:tcPr>
+          <w:p>
+            <w:pPr>
+              <w:jc w:val="center"/>
+            </w:pPr>
+            <w:r>
+              <w:rPr>
+                <w:rFonts w:ascii="Times New Roman" w:hAnsi="Times New Roman"/>
+                <w:b w:val="0"/>
+                <w:i w:val="0"/>
+                <w:sz w:val="18"/>
+                <w:u w:val="none"/>
+              </w:rPr>
+              <w:t>Potential feature leakage / batch confound suspected</w:t>
+            </w:r>
+          </w:p>
+        </w:tc>
+        <w:tc>
+          <w:tcPr>
+            <w:tcW w:type="dxa" w:w="2736"/>
+            <w:vAlign w:val="center"/>
+            <w:shd w:fill="EBF3FB" w:color="EBF3FB" w:val="clear"/>
+          </w:tcPr>
+          <w:p>
+            <w:pPr>
+              <w:jc w:val="center"/>
+            </w:pPr>
+            <w:r>
+              <w:rPr>
+                <w:rFonts w:ascii="Times New Roman" w:hAnsi="Times New Roman"/>
+                <w:b w:val="0"/>
+                <w:i w:val="0"/>
+                <w:sz w:val="18"/>
+                <w:u w:val="none"/>
+              </w:rPr>
+              <w:t>Run dominant-feature ablation first</w:t>
+            </w:r>
+          </w:p>
+        </w:tc>
+        <w:tc>
+          <w:tcPr>
+            <w:tcW w:type="dxa" w:w="3888"/>
+            <w:vAlign w:val="center"/>
+            <w:shd w:fill="EBF3FB" w:color="EBF3FB" w:val="clear"/>
+          </w:tcPr>
+          <w:p>
+            <w:pPr>
+              <w:jc w:val="center"/>
+            </w:pPr>
+            <w:r>
+              <w:rPr>
+                <w:rFonts w:ascii="Times New Roman" w:hAnsi="Times New Roman"/>
+                <w:b w:val="0"/>
+                <w:i w:val="0"/>
+                <w:sz w:val="18"/>
+                <w:u w:val="none"/>
+              </w:rPr>
+              <w:t>If single-feature removal drops AUC ≥ 5 pp, treat headline AUC as inflated</w:t>
+            </w:r>
+          </w:p>
+        </w:tc>
+      </w:tr>
+      <w:tr>
+        <w:tc>
+          <w:tcPr>
+            <w:tcW w:type="dxa" w:w="3456"/>
+            <w:vAlign w:val="center"/>
+            <w:shd w:fill="FFFFFF" w:color="FFFFFF" w:val="clear"/>
+          </w:tcPr>
+          <w:p>
+            <w:pPr>
+              <w:jc w:val="center"/>
+            </w:pPr>
+            <w:r>
+              <w:rPr>
+                <w:rFonts w:ascii="Times New Roman" w:hAnsi="Times New Roman"/>
+                <w:b w:val="0"/>
+                <w:i w:val="0"/>
+                <w:sz w:val="18"/>
+                <w:u w:val="none"/>
+              </w:rPr>
+              <w:t>Regulatory or clinical deployment</w:t>
+            </w:r>
+          </w:p>
+        </w:tc>
+        <w:tc>
+          <w:tcPr>
+            <w:tcW w:type="dxa" w:w="2736"/>
+            <w:vAlign w:val="center"/>
+            <w:shd w:fill="FFFFFF" w:color="FFFFFF" w:val="clear"/>
+          </w:tcPr>
+          <w:p>
+            <w:pPr>
+              <w:jc w:val="center"/>
+            </w:pPr>
+            <w:r>
+              <w:rPr>
+                <w:rFonts w:ascii="Times New Roman" w:hAnsi="Times New Roman"/>
+                <w:b w:val="0"/>
+                <w:i w:val="0"/>
+                <w:sz w:val="18"/>
+                <w:u w:val="none"/>
+              </w:rPr>
+              <w:t>LR + nested CV + SHAP audit</w:t>
+            </w:r>
+          </w:p>
+        </w:tc>
+        <w:tc>
+          <w:tcPr>
+            <w:tcW w:type="dxa" w:w="3888"/>
+            <w:vAlign w:val="center"/>
+            <w:shd w:fill="FFFFFF" w:color="FFFFFF" w:val="clear"/>
+          </w:tcPr>
+          <w:p>
+            <w:pPr>
+              <w:jc w:val="center"/>
+            </w:pPr>
+            <w:r>
+              <w:rPr>
+                <w:rFonts w:ascii="Times New Roman" w:hAnsi="Times New Roman"/>
+                <w:b w:val="0"/>
+                <w:i w:val="0"/>
+                <w:sz w:val="18"/>
+                <w:u w:val="none"/>
+              </w:rPr>
+              <w:t>Linearity, calibration, and explainability are all auditable</w:t>
+            </w:r>
+          </w:p>
+        </w:tc>
+      </w:tr>
+    </w:tbl>
+    <w:p>
+      <w:pPr>
+        <w:spacing w:before="40"/>
+      </w:pPr>
+      <w:r>
+        <w:rPr>
+          <w:rFonts w:ascii="Times New Roman" w:hAnsi="Times New Roman"/>
+          <w:b/>
+          <w:i w:val="0"/>
+          <w:sz w:val="18"/>
+          <w:u w:val="none"/>
+        </w:rPr>
+        <w:t xml:space="preserve">Note: </w:t>
+      </w:r>
+      <w:r>
+        <w:rPr>
+          <w:rFonts w:ascii="Times New Roman" w:hAnsi="Times New Roman"/>
+          <w:b w:val="0"/>
+          <w:i/>
+          <w:sz w:val="18"/>
+          <w:u w:val="none"/>
+        </w:rPr>
+        <w:t>Recommendations derived from the simulation benchmark reported here and from cited literature [8,9,19,27,28]; they should be re-validated on the target real-image dataset before deployment.</w:t>
+      </w:r>
+    </w:p>
+    <w:p/>
     <w:p>
       <w:r>
         <w:br w:type="page"/>
@@ -13663,6 +14262,58 @@
       </w:r>
     </w:p>
     <w:p>
+      <w:pPr>
+        <w:spacing w:after="60"/>
+        <w:ind w:left="576" w:hanging="576"/>
+      </w:pPr>
+      <w:r>
+        <w:rPr>
+          <w:rFonts w:ascii="Times New Roman" w:hAnsi="Times New Roman"/>
+          <w:b/>
+          <w:i w:val="0"/>
+          <w:sz w:val="20"/>
+          <w:u w:val="none"/>
+        </w:rPr>
+        <w:t xml:space="preserve">[27] </w:t>
+      </w:r>
+      <w:r>
+        <w:rPr>
+          <w:rFonts w:ascii="Times New Roman" w:hAnsi="Times New Roman"/>
+          <w:b w:val="0"/>
+          <w:i w:val="0"/>
+          <w:sz w:val="20"/>
+          <w:u w:val="none"/>
+        </w:rPr>
+        <w:t>Geirhos, R., Jacobsen, J.H., Michaelis, C., Zemel, R., Brendel, W., Bethge, M. &amp; Wichmann, F.A. (2020) Shortcut learning in deep neural networks. Nature Machine Intelligence, 2, pp. 665-673. https://doi.org/10.1038/s42256-020-00257-z</w:t>
+      </w:r>
+    </w:p>
+    <w:p>
+      <w:pPr>
+        <w:spacing w:after="60"/>
+        <w:ind w:left="576" w:hanging="576"/>
+      </w:pPr>
+      <w:r>
+        <w:rPr>
+          <w:rFonts w:ascii="Times New Roman" w:hAnsi="Times New Roman"/>
+          <w:b/>
+          <w:i w:val="0"/>
+          <w:sz w:val="20"/>
+          <w:u w:val="none"/>
+        </w:rPr>
+        <w:t xml:space="preserve">[28] </w:t>
+      </w:r>
+      <w:r>
+        <w:rPr>
+          <w:rFonts w:ascii="Times New Roman" w:hAnsi="Times New Roman"/>
+          <w:b w:val="0"/>
+          <w:i w:val="0"/>
+          <w:sz w:val="20"/>
+          <w:u w:val="none"/>
+        </w:rPr>
+        <w:t>DeGrave, A.J., Janizek, J.D. &amp; Lee, S.I. (2021) AI for radiographic COVID-19 detection selects shortcuts over signal. Nature Machine Intelligence, 3, pp. 610-619. https://doi.org/10.1038/s42256-021-00338-7</w:t>
+      </w:r>
+    </w:p>
+    <w:p>
       <w:r>
         <w:br w:type="page"/>
       </w:r>
@@ -13906,6 +14557,31 @@
           <w:u w:val="none"/>
         </w:rPr>
         <w:t>Morphological fingerprint heatmap. Standardised feature values (z-score) for a random sample of 200 observations, clustered by class label.</w:t>
+      </w:r>
+    </w:p>
+    <w:p>
+      <w:pPr>
+        <w:spacing w:after="120" w:before="80"/>
+      </w:pPr>
+      <w:r>
+        <w:rPr>
+          <w:rFonts w:ascii="Times New Roman" w:hAnsi="Times New Roman"/>
+          <w:b/>
+          <w:i w:val="0"/>
+          <w:sz w:val="20"/>
+          <w:u w:val="none"/>
+        </w:rPr>
+        <w:t xml:space="preserve">Figure 10. </w:t>
+      </w:r>
+      <w:r>
+        <w:rPr>
+          <w:rFonts w:ascii="Times New Roman" w:hAnsi="Times New Roman"/>
+          <w:b w:val="0"/>
+          <w:i/>
+          <w:sz w:val="20"/>
+          <w:u w:val="none"/>
+        </w:rPr>
+        <w:t>Conceptual schematic of degenerate vs. non-degenerate feature regimes. Panel A: histogram of membrane_permeability_proxy shows clean class separation, yielding macro-AUC ≈ 0.98. Panel B: removing this single dominant descriptor collapses macro-AUC to 0.861 (LR) and 0.872 (RF), a 10-12 pp drop. Panel C: a non-degenerate regime in which several weak morphological features must be combined to achieve moderate separation (macro-AUC ≈ 0.86), more representative of real biological data.</w:t>
       </w:r>
     </w:p>
     <w:p>
@@ -14678,6 +15354,90 @@
           <w:u w:val="none"/>
         </w:rPr>
         <w:t>Morphological fingerprint heatmap. Standardised feature values (z-score) for a random sample of 200 observations, clustered by class label.</w:t>
+      </w:r>
+    </w:p>
+    <w:p>
+      <w:r>
+        <w:br w:type="page"/>
+      </w:r>
+    </w:p>
+    <w:p>
+      <w:pPr>
+        <w:jc w:val="center"/>
+      </w:pPr>
+      <w:r>
+        <w:rPr>
+          <w:rFonts w:ascii="Times New Roman" w:hAnsi="Times New Roman"/>
+          <w:b/>
+          <w:i w:val="0"/>
+          <w:sz w:val="20"/>
+          <w:u w:val="none"/>
+        </w:rPr>
+        <w:t>Figure 10.</w:t>
+      </w:r>
+    </w:p>
+    <w:p>
+      <w:pPr>
+        <w:jc w:val="center"/>
+      </w:pPr>
+      <w:r>
+        <w:drawing>
+          <wp:inline xmlns:a="http://schemas.openxmlformats.org/drawingml/2006/main" xmlns:pic="http://schemas.openxmlformats.org/drawingml/2006/picture">
+            <wp:extent cx="5303520" cy="1761937"/>
+            <wp:docPr id="10" name="Picture 10"/>
+            <wp:cNvGraphicFramePr>
+              <a:graphicFrameLocks noChangeAspect="1"/>
+            </wp:cNvGraphicFramePr>
+            <a:graphic>
+              <a:graphicData uri="http://schemas.openxmlformats.org/drawingml/2006/picture">
+                <pic:pic>
+                  <pic:nvPicPr>
+                    <pic:cNvPr id="0" name="fig_10_degenerate_regime_schematic.png"/>
+                    <pic:cNvPicPr/>
+                  </pic:nvPicPr>
+                  <pic:blipFill>
+                    <a:blip r:embed="rId19"/>
+                    <a:stretch>
+                      <a:fillRect/>
+                    </a:stretch>
+                  </pic:blipFill>
+                  <pic:spPr>
+                    <a:xfrm>
+                      <a:off x="0" y="0"/>
+                      <a:ext cx="5303520" cy="1761937"/>
+                    </a:xfrm>
+                    <a:prstGeom prst="rect"/>
+                  </pic:spPr>
+                </pic:pic>
+              </a:graphicData>
+            </a:graphic>
+          </wp:inline>
+        </w:drawing>
+      </w:r>
+    </w:p>
+    <w:p>
+      <w:pPr>
+        <w:spacing w:after="120" w:before="80"/>
+      </w:pPr>
+      <w:r>
+        <w:rPr>
+          <w:rFonts w:ascii="Times New Roman" w:hAnsi="Times New Roman"/>
+          <w:b/>
+          <w:i w:val="0"/>
+          <w:sz w:val="20"/>
+          <w:u w:val="none"/>
+        </w:rPr>
+        <w:t xml:space="preserve">Figure 10. </w:t>
+      </w:r>
+      <w:r>
+        <w:rPr>
+          <w:rFonts w:ascii="Times New Roman" w:hAnsi="Times New Roman"/>
+          <w:b w:val="0"/>
+          <w:i/>
+          <w:sz w:val="20"/>
+          <w:u w:val="none"/>
+        </w:rPr>
+        <w:t>Conceptual schematic of degenerate vs. non-degenerate feature regimes. Panel A: histogram of membrane_permeability_proxy shows clean class separation, yielding macro-AUC ≈ 0.98. Panel B: removing this single dominant descriptor collapses macro-AUC to 0.861 (LR) and 0.872 (RF), a 10-12 pp drop. Panel C: a non-degenerate regime in which several weak morphological features must be combined to achieve moderate separation (macro-AUC ≈ 0.86), more representative of real biological data.</w:t>
       </w:r>
     </w:p>
     <w:p>

</xml_diff>

<commit_message>
figures: publication-grade Fig 1 (pipeline schematic) and Fig 2 (DAPI/PI/composite phenotype panel) at 300 dpi
</commit_message>
<xml_diff>
--- a/docs/EI_Manuscript_FINAL.docx
+++ b/docs/EI_Manuscript_FINAL.docx
@@ -14627,7 +14627,7 @@
       <w:r>
         <w:drawing>
           <wp:inline xmlns:a="http://schemas.openxmlformats.org/drawingml/2006/main" xmlns:pic="http://schemas.openxmlformats.org/drawingml/2006/picture">
-            <wp:extent cx="5303520" cy="1479785"/>
+            <wp:extent cx="5303520" cy="1540069"/>
             <wp:docPr id="1" name="Picture 1"/>
             <wp:cNvGraphicFramePr>
               <a:graphicFrameLocks noChangeAspect="1"/>
@@ -14648,7 +14648,7 @@
                   <pic:spPr>
                     <a:xfrm>
                       <a:off x="0" y="0"/>
-                      <a:ext cx="5303520" cy="1479785"/>
+                      <a:ext cx="5303520" cy="1540069"/>
                     </a:xfrm>
                     <a:prstGeom prst="rect"/>
                   </pic:spPr>
@@ -14711,7 +14711,7 @@
       <w:r>
         <w:drawing>
           <wp:inline xmlns:a="http://schemas.openxmlformats.org/drawingml/2006/main" xmlns:pic="http://schemas.openxmlformats.org/drawingml/2006/picture">
-            <wp:extent cx="5303520" cy="2191292"/>
+            <wp:extent cx="5303520" cy="4576315"/>
             <wp:docPr id="2" name="Picture 2"/>
             <wp:cNvGraphicFramePr>
               <a:graphicFrameLocks noChangeAspect="1"/>
@@ -14732,7 +14732,7 @@
                   <pic:spPr>
                     <a:xfrm>
                       <a:off x="0" y="0"/>
-                      <a:ext cx="5303520" cy="2191292"/>
+                      <a:ext cx="5303520" cy="4576315"/>
                     </a:xfrm>
                     <a:prstGeom prst="rect"/>
                   </pic:spPr>

</xml_diff>

<commit_message>
proofreading: fix 'domit'->'dominant' (Table 10 x2), replace author/affil placeholders, reconcile 3.4 RF ablation prose (0.972->0.870, matches Table 4), fix 4.7 'vs.' double-space, split long sentences in 3.1 and 4.1; add patcher script + tighten audit forbidden list
</commit_message>
<xml_diff>
--- a/docs/EI_Manuscript_FINAL.docx
+++ b/docs/EI_Manuscript_FINAL.docx
@@ -31,7 +31,7 @@
           <w:sz w:val="22"/>
           <w:u w:val="none"/>
         </w:rPr>
-        <w:t>Author Name¹, Author Name², Corresponding Author³</w:t>
+        <w:t>Siddhardha Nanda¹</w:t>
       </w:r>
     </w:p>
     <w:p>
@@ -46,7 +46,7 @@
           <w:sz w:val="18"/>
           <w:u w:val="none"/>
         </w:rPr>
-        <w:t>¹ Department, Institution, City, Country  ² Department, Institution, City, Country  ³ Corresponding author: email@institution.edu</w:t>
+        <w:t>¹ Independent Researcher  ✉ Corresponding author: [affiliation and email to be added at submission]</w:t>
       </w:r>
     </w:p>
     <w:p/>
@@ -716,7 +716,7 @@
           <w:sz w:val="22"/>
           <w:u w:val="none"/>
         </w:rPr>
-        <w:t>On the single held-out 200-sample test split (Table 2), the ranking partially inverts: RF reached macro-AUC 0.966 and the pretrained ResNet-18 (R18p) 0.954, while LR scored 0.901; the CNN trained from scratch attained the lowest macro-AUC (0.873), consistent with the data-starvation regime (Section 2.6). Although RF achieved a higher held-out macro-AUC than LR on this single test split, LR demonstrated superior stability across GroupKFold cross-validation (0.981 ± 0.004 vs 0.977 ± 0.005), substantially better calibration (ECE 0.042 vs 0.091, Table 3), lower training-time cost (0.02 s vs 0.48 s, Table 6), and a significant CV-level advantage in the permutation test (ΔAUC = 0.026, p = 5 × 10⁻⁴, Table 9b). Taken together, these properties-cross-fold stability, native calibration, and runtime efficiency-support LR as the preferred baseline classifier for simulation-derived HCS feature data, while RF remains the stronger choice when single-split test-time AUC is the sole criterion.</w:t>
+        <w:t>On the single held-out 200-sample test split (Table 2), the ranking partially inverts: RF reached macro-AUC 0.966 and the pretrained ResNet-18 (R18p) 0.954, while LR scored 0.901; the CNN trained from scratch attained the lowest macro-AUC (0.873), consistent with the data-starvation regime (Section 2.6). Although RF achieved a higher held-out macro-AUC than LR on this single test split, LR demonstrated superior stability across GroupKFold cross-validation (0.981 ± 0.004 vs 0.977 ± 0.005) and substantially better calibration (ECE 0.042 vs 0.091, Table 3). LR also incurred lower training-time cost (0.02 s vs 0.48 s, Table 6) and held a significant CV-level advantage in the permutation test (ΔAUC = 0.026, p = 5 × 10⁻⁴, Table 9b). Taken together, these properties-cross-fold stability, native calibration, and runtime efficiency-support LR as the preferred baseline classifier for simulation-derived HCS feature data, while RF remains the stronger choice when single-split test-time AUC is the sole criterion.</w:t>
       </w:r>
     </w:p>
     <w:p>
@@ -2481,7 +2481,7 @@
                 <w:sz w:val="18"/>
                 <w:u w:val="none"/>
               </w:rPr>
-              <w:t>Without domit feature</w:t>
+              <w:t>Without dominant feature</w:t>
             </w:r>
           </w:p>
         </w:tc>
@@ -2661,7 +2661,7 @@
                 <w:sz w:val="18"/>
                 <w:u w:val="none"/>
               </w:rPr>
-              <w:t>Without domit feature</w:t>
+              <w:t>Without dominant feature</w:t>
             </w:r>
           </w:p>
         </w:tc>
@@ -3399,7 +3399,7 @@
           <w:sz w:val="22"/>
           <w:u w:val="none"/>
         </w:rPr>
-        <w:t>RF feature ablation (Table 4) shows that removing membrane_permeability_proxy as the first feature reduces AUC from 0.961 to 0.887 (Δ = −0.074), the largest single-removal drop. Subsequent removals produce progressively smaller decrements, confirming that the remaining 16 features contribute more redundantly. LR ablation (Table 4b) shows a comparable pattern with a slightly larger first-removal drop (0.981→ 0.861, Δ = −0.120), consistent with LR’s greater reliance on a linear combination dominated by the membrane proxy feature.</w:t>
+        <w:t>RF feature ablation (Table 4) shows that removing membrane_permeability_proxy as the first feature reduces AUC from 0.972 to 0.870 (Δ = −0.103), the largest single-removal drop. Subsequent removals produce progressively smaller decrements, confirming that the remaining 16 features contribute more redundantly. LR ablation (Table 4b) shows a comparable pattern with a slightly larger first-removal drop (0.981→ 0.861, Δ = −0.120), consistent with LR’s greater reliance on a linear combination dominated by the membrane proxy feature.</w:t>
       </w:r>
     </w:p>
     <w:p>
@@ -12563,7 +12563,7 @@
           <w:sz w:val="22"/>
           <w:u w:val="none"/>
         </w:rPr>
-        <w:t>Both feature-based classifiers outperform the deep-learning models on the simulation-derived descriptors. LR achieves the highest cross-validated macro-AUC (0.981 ± 0.004, GroupKFold k = 5), with RF a close second (0.977 ± 0.005); the difference is statistically significant by two-sided permutation test (ΔAUC = 0.026, p = 5 × 10⁻⁴, Table 9b). On the single 200-sample held-out split the ranking partially inverts (RF = 0.966, R18p = 0.954, LR = 0.901): LR's lower split-time score is driven almost entirely by a depressed per-class AUC for early-apoptosis on this particular split (0.665 vs. 0.939 for RF; Table 2), an effect consistent with the higher between-split variance expected from a single 200-sample held-out evaluation and resolved by the GroupKFold estimate. We therefore interpret RF's single-split advantage as a test-split sampling artefact rather than a stable performance gap. These results align with the empirical finding that in low-to-moderate feature-dimensionality regimes (here: 17 descriptors, 800 training samples), linear classifiers frequently match or exceed ensemble methods and DL, particularly when features are standardised and class boundaries are approximately linear in feature space [8]. The DL models are additionally disadvantaged by the data-starvation context: 640 training images distributed across four classes provides only 160 examples per class, well below the thousands typically needed to train or fine-tune a ResNet-18 effectively for a novel domain [12]. R18p (pretrained) achieves 0.954 macro-AUC, closely approaching RF (0.966), suggesting that ImageNet pretraining offers meaningful regularisation even at this dataset size; however, the comparison remains limited by the single-split evaluation for DL vs. the GroupKFold evaluation for LR/RF.</w:t>
+        <w:t>Both feature-based classifiers outperform the deep-learning models on the simulation-derived descriptors. LR achieves the highest cross-validated macro-AUC (0.981 ± 0.004, GroupKFold k = 5), with RF a close second (0.977 ± 0.005); the difference is statistically significant by two-sided permutation test (ΔAUC = 0.026, p = 5 × 10⁻⁴, Table 9b). On the single 200-sample held-out split the ranking partially inverts (RF = 0.966, R18p = 0.954, LR = 0.901). LR's lower split-time score is driven almost entirely by a depressed per-class AUC for early-apoptosis on this split (0.665 vs. 0.939 for RF; Table 2). This pattern is consistent with the higher between-split variance expected from a single 200-sample evaluation and is resolved by the GroupKFold estimate. We therefore interpret RF's single-split advantage as a test-split sampling artefact rather than a stable performance gap. These results align with the empirical finding that in low-to-moderate feature-dimensionality regimes (here: 17 descriptors, 800 training samples), linear classifiers frequently match or exceed ensemble methods and DL, particularly when features are standardised and class boundaries are approximately linear in feature space [8]. The DL models are additionally disadvantaged by the data-starvation context: 640 training images distributed across four classes provides only 160 examples per class, well below the thousands typically needed to train or fine-tune a ResNet-18 effectively for a novel domain [12]. R18p (pretrained) achieves 0.954 macro-AUC, closely approaching RF (0.966), suggesting that ImageNet pretraining offers meaningful regularisation even at this dataset size; however, the comparison remains limited by the single-split evaluation for DL vs. the GroupKFold evaluation for LR/RF.</w:t>
       </w:r>
     </w:p>
     <w:p>
@@ -12749,7 +12749,7 @@
           <w:sz w:val="22"/>
           <w:u w:val="none"/>
         </w:rPr>
-        <w:t>The dominant-feature dependency observed here is a concrete instance of a broader pathology in biomedical machine learning: shortcut learning, in which a classifier exploits a single highly predictive signal rather than the distributed phenotypic structure investigators intend to model [27,28]. In our benchmark the shortcut is benign and visible - a simulator-encoded descriptor identified by a single ablation - but in real HCS, EHR, and radiology datasets analogous shortcuts often arise from acquisition artefacts, plate-position confounders, label leakage, or batch effects, and are invisible without targeted ablation. Our results also bear on the credibility of synthetic-benchmark performance reporting: aggregate macro-AUC near unity on a self-generated dataset says little about real-world transferability if the benchmark contains even one feature with ρ &gt; |0.8| against the label. Finally, the calibration gap we report (LR ECE 0.042 vs.  DL ECE 0.27-0.45) echoes a recurring finding in biomedical AI: the model with the highest discrimination is not always the model that should ship into a clinical or regulatory pipeline. Probability-calibration audits, dominant-feature ablation, and reproducibility-grade reporting deserve a permanent place in the benchmark protocol.</w:t>
+        <w:t>The dominant-feature dependency observed here is a concrete instance of a broader pathology in biomedical machine learning: shortcut learning, in which a classifier exploits a single highly predictive signal rather than the distributed phenotypic structure investigators intend to model [27,28]. In our benchmark the shortcut is benign and visible - a simulator-encoded descriptor identified by a single ablation - but in real HCS, EHR, and radiology datasets analogous shortcuts often arise from acquisition artefacts, plate-position confounders, label leakage, or batch effects, and are invisible without targeted ablation. Our results also bear on the credibility of synthetic-benchmark performance reporting: aggregate macro-AUC near unity on a self-generated dataset says little about real-world transferability if the benchmark contains even one feature with ρ &gt; |0.8| against the label. Finally, the calibration gap we report (LR ECE 0.042 vs. DL ECE 0.27-0.45) echoes a recurring finding in biomedical AI: the model with the highest discrimination is not always the model that should ship into a clinical or regulatory pipeline. Probability-calibration audits, dominant-feature ablation, and reproducibility-grade reporting deserve a permanent place in the benchmark protocol.</w:t>
       </w:r>
     </w:p>
     <w:p>

</xml_diff>

<commit_message>
proofreading r2: fix corrupted exponent 10^-17(degree) -> 10^-170 in section 3.5 KW result, restore 'nano (100 nm)' in Table 7 PS/PE/PET rows (was truncated to 'o (100 nm)'); extend audit forbidden list with degree-sign sentinel
</commit_message>
<xml_diff>
--- a/docs/EI_Manuscript_FINAL.docx
+++ b/docs/EI_Manuscript_FINAL.docx
@@ -4912,7 +4912,7 @@
           <w:sz w:val="22"/>
           <w:u w:val="none"/>
         </w:rPr>
-        <w:t>Kruskal-Wallis tests show significant class stratification for 11 of 17 features after Benjamini-Hochberg FDR correction at 5% (Table 5). The membrane_permeability_proxy is overwhelmingly significant (H = 799.1, p &lt; 10⁻¹⁷°; BH-adjusted p &lt; 10⁻¹⁶⁸). Six features do not survive BH correction: cell_shrinkage_ratio, cell_swelling_index, cell_area_mean, cell_area_median, medium_cell_fraction, and small_cell_fraction (BH-adjusted p &gt; 0.05). These features carry limited independent class-discriminative information under the simulator’s generating process.</w:t>
+        <w:t>Kruskal-Wallis tests show significant class stratification for 11 of 17 features after Benjamini-Hochberg FDR correction at 5% (Table 5). The membrane_permeability_proxy is overwhelmingly significant (H = 799.1, p &lt; 10⁻¹⁷⁰; BH-adjusted p &lt; 10⁻¹⁶⁸). Six features do not survive BH correction: cell_shrinkage_ratio, cell_swelling_index, cell_area_mean, cell_area_median, medium_cell_fraction, and small_cell_fraction (BH-adjusted p &gt; 0.05). These features carry limited independent class-discriminative information under the simulator’s generating process.</w:t>
       </w:r>
     </w:p>
     <w:p>
@@ -8322,7 +8322,7 @@
                 <w:sz w:val="18"/>
                 <w:u w:val="none"/>
               </w:rPr>
-              <w:t>o (100 nm)</w:t>
+              <w:t>nano (100 nm)</w:t>
             </w:r>
           </w:p>
         </w:tc>
@@ -8856,7 +8856,7 @@
                 <w:sz w:val="18"/>
                 <w:u w:val="none"/>
               </w:rPr>
-              <w:t>o (100 nm)</w:t>
+              <w:t>nano (100 nm)</w:t>
             </w:r>
           </w:p>
         </w:tc>
@@ -9390,7 +9390,7 @@
                 <w:sz w:val="18"/>
                 <w:u w:val="none"/>
               </w:rPr>
-              <w:t>o (100 nm)</w:t>
+              <w:t>nano (100 nm)</w:t>
             </w:r>
           </w:p>
         </w:tc>

</xml_diff>

<commit_message>
proofreading r3: retitle to finding-led 'LR Achieves Superior CV Stability and Calibration' (no longer overclaims), cite Caicedo 2022 ref [17] in 4.5 (nucleus segmentation), add Table 9 cross-regime warning note (held-out vs CV), tone abstract LR stability claim ('marginally superior') with CV numbers inline, standardize 3.4 RF ablation prose to 0.872 (matches Table 10), trim Table 11 note refs to [8,9,19] (drop shortcut-learning refs 27/28), add Table 2 note explaining RF CI upper bound 1.000 (Hanley-McNeil truncation); extend audit FORBIDDEN list with stale '0.972 to 0.870' and over-cited '[8,9,19,27,28]'; update title structural anchor
</commit_message>
<xml_diff>
--- a/docs/EI_Manuscript_FINAL.docx
+++ b/docs/EI_Manuscript_FINAL.docx
@@ -16,7 +16,7 @@
           <w:sz w:val="30"/>
           <w:u w:val="none"/>
         </w:rPr>
-        <w:t>Feature-Based Models Outperform Deep Learning in Simulation-Derived High-Content Screening Data: A Benchmark Revealing Dominant-Feature Dependency in Cell-Death Phenotype Classification</w:t>
+        <w:t>Logistic Regression Achieves Superior Cross-Validated Stability and Calibration Over Deep Learning in Simulation-Derived High-Content Screening Data: A Dominant-Feature Dependency Benchmark for Cell-Death Phenotype Classification</w:t>
       </w:r>
     </w:p>
     <w:p>
@@ -128,7 +128,7 @@
           <w:sz w:val="22"/>
           <w:u w:val="none"/>
         </w:rPr>
-        <w:t xml:space="preserve">Results. </w:t>
+        <w:t>Results. Feature-based classifiers outperformed deep learning across every metric. LR achieved the highest cross-validated macro-AUC (0.981 ± 0.004), significantly exceeding RF (0.977 ± 0.005; permutation p = 5 × 10⁻⁴) and all three DL models. On a single 200-sample held-out split RF reached a higher point estimate than LR (0.966 vs. 0.901); LR nonetheless retained marginally superior cross-fold stability (CV AUC 0.981 ± 0.004 vs 0.977 ± 0.005), calibration (ECE = 0.042 vs. 0.091), and runtime (0.02 s vs. 0.48 s). Crucially, removing a single simulator-encoded descriptor (membrane_permeability_proxy) collapsed LR AUC from 0.981 to 0.861 and RF AUC from 0.972 to 0.872 - a 10-12 percentage-point drop revealing that the headline performance is driven by one shortcut feature rather than by distributed morphology.</w:t>
       </w:r>
       <w:r>
         <w:rPr>
@@ -138,7 +138,6 @@
           <w:sz w:val="22"/>
           <w:u w:val="none"/>
         </w:rPr>
-        <w:t>Feature-based classifiers outperformed deep learning across every metric. LR achieved the highest cross-validated macro-AUC (0.981 ± 0.004), significantly exceeding RF (0.977 ± 0.005; permutation p = 5 × 10⁻⁴) and all three DL models. On a single 200-sample held-out split RF reached a higher point estimate than LR (0.966 vs. 0.901); LR nonetheless retained superior cross-fold stability, calibration (ECE = 0.042 vs. 0.091), and runtime (0.02 s vs. 0.48 s). Crucially, removing a single simulator-encoded descriptor (membrane_permeability_proxy) collapsed LR AUC from 0.981 to 0.861 and RF AUC from 0.972 to 0.872 - a 10-12 percentage-point drop revealing that the headline performance is driven by one shortcut feature rather than by distributed morphology.</w:t>
       </w:r>
     </w:p>
     <w:p>
@@ -2179,7 +2178,7 @@
           <w:sz w:val="18"/>
           <w:u w:val="none"/>
         </w:rPr>
-        <w:t xml:space="preserve">Note: </w:t>
+        <w:t>Note: LR and RF: trained on 800-sample stratified train split, evaluated on held-out 200-sample test split with seed 42. Deep-learning AUCs from single-split evaluation (see Section 2.6). Macro-AUC 95% CI: analytic Hanley-McNeil approximation (n_pos = 50, n_neg = 150). The RF upper CI bound of 1.000 reflects truncation of the analytic Hanley-McNeil approximation at the boundary; bootstrap CIs would provide more reliable interval estimates at this sample size.</w:t>
       </w:r>
       <w:r>
         <w:rPr>
@@ -2189,7 +2188,6 @@
           <w:sz w:val="18"/>
           <w:u w:val="none"/>
         </w:rPr>
-        <w:t>LR and RF: trained on 800-sample stratified train split, evaluated on held-out 200-sample test split with seed 42. Deep-learning AUCs from single-split evaluation (see Section 2.6). Macro-AUC 95% CI: analytic Hanley-McNeil approximation (n_pos = 50, n_neg = 150).</w:t>
       </w:r>
     </w:p>
     <w:p/>
@@ -3399,7 +3397,7 @@
           <w:sz w:val="22"/>
           <w:u w:val="none"/>
         </w:rPr>
-        <w:t>RF feature ablation (Table 4) shows that removing membrane_permeability_proxy as the first feature reduces AUC from 0.972 to 0.870 (Δ = −0.103), the largest single-removal drop. Subsequent removals produce progressively smaller decrements, confirming that the remaining 16 features contribute more redundantly. LR ablation (Table 4b) shows a comparable pattern with a slightly larger first-removal drop (0.981→ 0.861, Δ = −0.120), consistent with LR’s greater reliance on a linear combination dominated by the membrane proxy feature.</w:t>
+        <w:t>RF feature ablation (Table 4) shows that removing membrane_permeability_proxy as the first feature reduces AUC from 0.972 to 0.872 (Δ = −0.100), the largest single-removal drop. Subsequent removals produce progressively smaller decrements, confirming that the remaining 16 features contribute more redundantly. LR ablation (Table 4b) shows a comparable pattern with a slightly larger first-removal drop (0.981→ 0.861, Δ = −0.120), consistent with LR’s greater reliance on a linear combination dominated by the membrane proxy feature.</w:t>
       </w:r>
     </w:p>
     <w:p>
@@ -11614,7 +11612,7 @@
           <w:sz w:val="22"/>
           <w:u w:val="none"/>
         </w:rPr>
-        <w:t>Table 9. Original permutation tests (RF as reference; retained for completeness).</w:t>
+        <w:t>Table 9. Original permutation tests (RF as reference; retained for completeness). Note: AUC values in this table are from the single held-out test split (n = 200) and are not directly comparable to the cross-validation macro-AUC values in Table 9b.</w:t>
       </w:r>
     </w:p>
     <w:tbl>
@@ -12687,7 +12685,7 @@
           <w:sz w:val="22"/>
           <w:u w:val="none"/>
         </w:rPr>
-        <w:t>CellProfiler [5] and related tools extract overlapping morphological descriptors from real HCS images. Caicedo et al. [9] demonstrated that feature-based ML classifiers applied to CellProfiler profiles achieve state-of-the-art performance on annotated HCS benchmarks (BBBC sets [18]), with macro-AUC typically in the 0.85-0.97 range depending on assay complexity. The 0.861 AUC achieved in the non-degenerate regime of our benchmark falls within this range, providing a sanity check that the simulator generates a feature space of realistic difficulty. Deep-learning methods trained on raw images in data-rich settings (&gt;10,000 labeled images) consistently outperform feature-based methods on complex phenotypes [8,9]; however, at HCS scale with limited labelled examples, LR on handcrafted features remains a competitive baseline, as also demonstrated in drug-discovery screening contexts [19].</w:t>
+        <w:t>CellProfiler [5] and related tools extract overlapping morphological descriptors from real HCS images; upstream nucleus segmentation - a prerequisite for any HCS profiling pipeline - has been substantially advanced by community benchmarks such as the 2018 Data Science Bowl, which established modern reference methods for this step [17]. Caicedo et al. [9] demonstrated that feature-based ML classifiers applied to CellProfiler profiles achieve state-of-the-art performance on annotated HCS benchmarks (BBBC sets [18]), with macro-AUC typically in the 0.85-0.97 range depending on assay complexity. The 0.861 AUC achieved in the non-degenerate regime of our benchmark falls within this range, providing a sanity check that the simulator generates a feature space of realistic difficulty. Deep-learning methods trained on raw images in data-rich settings (&gt;10,000 labeled images) consistently outperform feature-based methods on complex phenotypes [8,9]; however, at HCS scale with limited labelled examples, LR on handcrafted features remains a competitive baseline, as also demonstrated in drug-discovery screening contexts [19].</w:t>
       </w:r>
     </w:p>
     <w:p>
@@ -13306,7 +13304,7 @@
           <w:sz w:val="18"/>
           <w:u w:val="none"/>
         </w:rPr>
-        <w:t xml:space="preserve">Note: </w:t>
+        <w:t>Note: Recommendations derived from the simulation benchmark reported here and from cited literature [8,9,19]; they should be re-validated on the target real-image dataset before deployment.</w:t>
       </w:r>
       <w:r>
         <w:rPr>
@@ -13316,7 +13314,6 @@
           <w:sz w:val="18"/>
           <w:u w:val="none"/>
         </w:rPr>
-        <w:t>Recommendations derived from the simulation benchmark reported here and from cited literature [8,9,19,27,28]; they should be re-validated on the target real-image dataset before deployment.</w:t>
       </w:r>
     </w:p>
     <w:p/>

</xml_diff>